<commit_message>
Batch seed inserts: 108 round trips instead of ~1,540
</commit_message>
<xml_diff>
--- a/Dastaan_Testing_Guide.docx
+++ b/Dastaan_Testing_Guide.docx
@@ -23671,7 +23671,7 @@
           <w:sz w:val="20"/>
           <w:szCs w:val="20"/>
         </w:rPr>
-        <w:t xml:space="preserve">The demo data is deterministic — the same figures come out every time, so a demo can be rehearsed. Rebuild it whenever it has been messed up, and the day before a demo so the diary sits on the right date.</w:t>
+        <w:t xml:space="preserve">The demo data is deterministic for a given day — re-running it on the same date gives identical figures, so a demo can be rehearsed. Rebuild it whenever it has been messed up, and the day before a demo so the diary sits on the right date.</w:t>
       </w:r>
     </w:p>
     <w:p>
@@ -23753,7 +23753,7 @@
           <w:sz w:val="20"/>
           <w:szCs w:val="20"/>
         </w:rPr>
-        <w:t xml:space="preserve">It writes about 1,500 rows and takes a couple of minutes, printing a dot per day so you can see it working. It runs as a single transaction: if it fails, or you stop it, everything rolls back and you simply run it again.</w:t>
+        <w:t xml:space="preserve">It writes about 1,500 rows in roughly 110 database round trips — about half a minute against Supabase. It prints a dot per day as it builds, then a dot per table as it writes. It runs as a single transaction: if it fails, or you stop it, everything rolls back and you simply run it again.</w:t>
       </w:r>
     </w:p>
     <w:p>
@@ -23767,7 +23767,7 @@
           <w:sz w:val="20"/>
           <w:szCs w:val="20"/>
         </w:rPr>
-        <w:t xml:space="preserve">Expect it to finish with roughly 445 invoices and about AED 100,000 of revenue across 42 trading days, 240 ratings and 9 registered clients.</w:t>
+        <w:t xml:space="preserve">Expect roughly 450–470 invoices and about AED 100,000 of revenue across 42 trading days, 250-odd ratings and 9 registered clients. The exact figures move with the day you run it on.</w:t>
       </w:r>
     </w:p>
     <w:p>

</xml_diff>

<commit_message>
Sign in with Google for clients; registration takes email and phone
The Google button on /login had no onClick and no backing route — it was
decorative. The PRD asks for it, so it is now real: server-side auth-code
flow with state, PKCE and nonce, issuing the same httpOnly session as the
password login. Clients only; a Google account cannot reach the console.

Registration now requires email and phone. Email is the link key: signing in
with Google using an address that already has a password account attaches to
it rather than creating a duplicate with a separate loyalty balance.

Off unless GOOGLE_CLIENT_ID/SECRET are set, in which case the API answers 503
and the web app hides the button entirely.
</commit_message>
<xml_diff>
--- a/Dastaan_Testing_Guide.docx
+++ b/Dastaan_Testing_Guide.docx
@@ -179,7 +179,7 @@
                 <w:sz w:val="17"/>
                 <w:szCs w:val="17"/>
               </w:rPr>
-              <w:t xml:space="preserve">Arbaaz Ghameriya · VectorShift</w:t>
+              <w:t xml:space="preserve">GGC FZE · licence 4429769.01 · Sharjah Publishing City Free Zone</w:t>
             </w:r>
           </w:p>
         </w:tc>
@@ -208,7 +208,7 @@
                 <w:sz w:val="17"/>
                 <w:szCs w:val="17"/>
               </w:rPr>
-              <w:t xml:space="preserve">Tested on</w:t>
+              <w:t xml:space="preserve">Contact</w:t>
             </w:r>
           </w:p>
         </w:tc>
@@ -233,7 +233,7 @@
                 <w:sz w:val="17"/>
                 <w:szCs w:val="17"/>
               </w:rPr>
-              <w:t xml:space="preserve">18–19 August 2026</w:t>
+              <w:t xml:space="preserve">Arbaaz Ghameriya</w:t>
             </w:r>
           </w:p>
         </w:tc>
@@ -262,7 +262,7 @@
                 <w:sz w:val="17"/>
                 <w:szCs w:val="17"/>
               </w:rPr>
-              <w:t xml:space="preserve">Environment</w:t>
+              <w:t xml:space="preserve">Tested on</w:t>
             </w:r>
           </w:p>
         </w:tc>
@@ -287,7 +287,7 @@
                 <w:sz w:val="17"/>
                 <w:szCs w:val="17"/>
               </w:rPr>
-              <w:t xml:space="preserve">Live deployment — Vercel, Render and Supabase</w:t>
+              <w:t xml:space="preserve">18–19 August 2026</w:t>
             </w:r>
           </w:p>
         </w:tc>
@@ -316,7 +316,7 @@
                 <w:sz w:val="17"/>
                 <w:szCs w:val="17"/>
               </w:rPr>
-              <w:t xml:space="preserve">Version</w:t>
+              <w:t xml:space="preserve">Environment</w:t>
             </w:r>
           </w:p>
         </w:tc>
@@ -341,7 +341,61 @@
                 <w:sz w:val="17"/>
                 <w:szCs w:val="17"/>
               </w:rPr>
-              <w:t xml:space="preserve">1.1 — adds the booking availability fix (D-1)</w:t>
+              <w:t xml:space="preserve">Live deployment — Vercel, Render and Supabase</w:t>
+            </w:r>
+          </w:p>
+        </w:tc>
+      </w:tr>
+      <w:tr>
+        <w:tc>
+          <w:tcPr>
+            <w:tcW w:type="dxa" w:w="2600"/>
+            <w:tcMar>
+              <w:top w:type="dxa" w:w="70"/>
+              <w:left w:type="dxa" w:w="110"/>
+              <w:bottom w:type="dxa" w:w="70"/>
+              <w:right w:type="dxa" w:w="110"/>
+            </w:tcMar>
+          </w:tcPr>
+          <w:p>
+            <w:pPr>
+              <w:spacing w:after="0" w:before="0" w:line="250"/>
+            </w:pPr>
+            <w:r>
+              <w:rPr>
+                <w:rFonts w:ascii="Calibri" w:cs="Calibri" w:eastAsia="Calibri" w:hAnsi="Calibri"/>
+                <w:b/>
+                <w:bCs/>
+                <w:color w:val="111111"/>
+                <w:sz w:val="17"/>
+                <w:szCs w:val="17"/>
+              </w:rPr>
+              <w:t xml:space="preserve">Version</w:t>
+            </w:r>
+          </w:p>
+        </w:tc>
+        <w:tc>
+          <w:tcPr>
+            <w:tcW w:type="dxa" w:w="6426"/>
+            <w:tcMar>
+              <w:top w:type="dxa" w:w="70"/>
+              <w:left w:type="dxa" w:w="110"/>
+              <w:bottom w:type="dxa" w:w="70"/>
+              <w:right w:type="dxa" w:w="110"/>
+            </w:tcMar>
+          </w:tcPr>
+          <w:p>
+            <w:pPr>
+              <w:spacing w:after="0" w:before="0" w:line="250"/>
+            </w:pPr>
+            <w:r>
+              <w:rPr>
+                <w:rFonts w:ascii="Calibri" w:cs="Calibri" w:eastAsia="Calibri" w:hAnsi="Calibri"/>
+                <w:color w:val="111111"/>
+                <w:sz w:val="17"/>
+                <w:szCs w:val="17"/>
+              </w:rPr>
+              <w:t xml:space="preserve">1.2 — adds Google sign-in, calendar history, walk-in records</w:t>
             </w:r>
           </w:p>
         </w:tc>
@@ -1000,6 +1054,110 @@
           </w:p>
         </w:tc>
       </w:tr>
+      <w:tr>
+        <w:tc>
+          <w:tcPr>
+            <w:tcW w:type="dxa" w:w="2500"/>
+            <w:tcMar>
+              <w:top w:type="dxa" w:w="70"/>
+              <w:left w:type="dxa" w:w="110"/>
+              <w:bottom w:type="dxa" w:w="70"/>
+              <w:right w:type="dxa" w:w="110"/>
+            </w:tcMar>
+          </w:tcPr>
+          <w:p>
+            <w:pPr>
+              <w:spacing w:after="0" w:before="0" w:line="250"/>
+            </w:pPr>
+            <w:r>
+              <w:rPr>
+                <w:rFonts w:ascii="Calibri" w:cs="Calibri" w:eastAsia="Calibri" w:hAnsi="Calibri"/>
+                <w:b/>
+                <w:bCs/>
+                <w:color w:val="111111"/>
+                <w:sz w:val="17"/>
+                <w:szCs w:val="17"/>
+              </w:rPr>
+              <w:t xml:space="preserve">Sign in with Google</w:t>
+            </w:r>
+          </w:p>
+        </w:tc>
+        <w:tc>
+          <w:tcPr>
+            <w:tcW w:type="dxa" w:w="2900"/>
+            <w:tcMar>
+              <w:top w:type="dxa" w:w="70"/>
+              <w:left w:type="dxa" w:w="110"/>
+              <w:bottom w:type="dxa" w:w="70"/>
+              <w:right w:type="dxa" w:w="110"/>
+            </w:tcMar>
+          </w:tcPr>
+          <w:p>
+            <w:pPr>
+              <w:spacing w:after="0" w:before="0" w:line="250"/>
+            </w:pPr>
+            <w:r>
+              <w:rPr>
+                <w:rFonts w:ascii="Consolas" w:cs="Consolas" w:eastAsia="Consolas" w:hAnsi="Consolas"/>
+                <w:color w:val="111111"/>
+                <w:sz w:val="15"/>
+                <w:szCs w:val="15"/>
+              </w:rPr>
+              <w:t xml:space="preserve">Clients only · Google Cloud OAuth</w:t>
+            </w:r>
+          </w:p>
+        </w:tc>
+        <w:tc>
+          <w:tcPr>
+            <w:tcW w:type="dxa" w:w="2226"/>
+            <w:tcMar>
+              <w:top w:type="dxa" w:w="70"/>
+              <w:left w:type="dxa" w:w="110"/>
+              <w:bottom w:type="dxa" w:w="70"/>
+              <w:right w:type="dxa" w:w="110"/>
+            </w:tcMar>
+          </w:tcPr>
+          <w:p>
+            <w:pPr>
+              <w:spacing w:after="0" w:before="0" w:line="250"/>
+            </w:pPr>
+            <w:r>
+              <w:rPr>
+                <w:rFonts w:ascii="Calibri" w:cs="Calibri" w:eastAsia="Calibri" w:hAnsi="Calibri"/>
+                <w:color w:val="111111"/>
+                <w:sz w:val="17"/>
+                <w:szCs w:val="17"/>
+              </w:rPr>
+              <w:t xml:space="preserve">Switched on once credentials are set</w:t>
+            </w:r>
+          </w:p>
+        </w:tc>
+        <w:tc>
+          <w:tcPr>
+            <w:tcW w:type="dxa" w:w="1400"/>
+            <w:tcMar>
+              <w:top w:type="dxa" w:w="70"/>
+              <w:left w:type="dxa" w:w="110"/>
+              <w:bottom w:type="dxa" w:w="70"/>
+              <w:right w:type="dxa" w:w="110"/>
+            </w:tcMar>
+          </w:tcPr>
+          <w:p>
+            <w:pPr>
+              <w:spacing w:after="0" w:before="0" w:line="250"/>
+            </w:pPr>
+            <w:r>
+              <w:rPr>
+                <w:rFonts w:ascii="Calibri" w:cs="Calibri" w:eastAsia="Calibri" w:hAnsi="Calibri"/>
+                <w:color w:val="111111"/>
+                <w:sz w:val="17"/>
+                <w:szCs w:val="17"/>
+              </w:rPr>
+              <w:t xml:space="preserve">See section 5, P</w:t>
+            </w:r>
+          </w:p>
+        </w:tc>
+      </w:tr>
     </w:tbl>
     <w:p>
       <w:pPr>
@@ -1693,7 +1851,7 @@
                 <w:sz w:val="17"/>
                 <w:szCs w:val="17"/>
               </w:rPr>
-              <w:t xml:space="preserve">Master Barber</w:t>
+              <w:t xml:space="preserve">Barber</w:t>
             </w:r>
           </w:p>
         </w:tc>
@@ -1822,7 +1980,7 @@
                 <w:sz w:val="17"/>
                 <w:szCs w:val="17"/>
               </w:rPr>
-              <w:t xml:space="preserve">Senior Barber</w:t>
+              <w:t xml:space="preserve">Barber</w:t>
             </w:r>
           </w:p>
         </w:tc>
@@ -1951,7 +2109,7 @@
                 <w:sz w:val="17"/>
                 <w:szCs w:val="17"/>
               </w:rPr>
-              <w:t xml:space="preserve">Master Barber</w:t>
+              <w:t xml:space="preserve">Barber</w:t>
             </w:r>
           </w:p>
         </w:tc>
@@ -2209,7 +2367,7 @@
                 <w:sz w:val="17"/>
                 <w:szCs w:val="17"/>
               </w:rPr>
-              <w:t xml:space="preserve">Senior Barber</w:t>
+              <w:t xml:space="preserve">Barber</w:t>
             </w:r>
           </w:p>
         </w:tc>
@@ -2467,7 +2625,7 @@
                 <w:sz w:val="17"/>
                 <w:szCs w:val="17"/>
               </w:rPr>
-              <w:t xml:space="preserve">Senior Barber</w:t>
+              <w:t xml:space="preserve">Barber</w:t>
             </w:r>
           </w:p>
         </w:tc>
@@ -2596,7 +2754,7 @@
                 <w:sz w:val="17"/>
                 <w:szCs w:val="17"/>
               </w:rPr>
-              <w:t xml:space="preserve">Master Barber</w:t>
+              <w:t xml:space="preserve">Barber</w:t>
             </w:r>
           </w:p>
         </w:tc>
@@ -4278,7 +4436,7 @@
                 <w:sz w:val="44"/>
                 <w:szCs w:val="44"/>
               </w:rPr>
-              <w:t xml:space="preserve">94</w:t>
+              <w:t xml:space="preserve">114</w:t>
             </w:r>
           </w:p>
         </w:tc>
@@ -4306,7 +4464,7 @@
                 <w:sz w:val="44"/>
                 <w:szCs w:val="44"/>
               </w:rPr>
-              <w:t xml:space="preserve">92</w:t>
+              <w:t xml:space="preserve">111</w:t>
             </w:r>
           </w:p>
         </w:tc>
@@ -4334,7 +4492,7 @@
                 <w:sz w:val="44"/>
                 <w:szCs w:val="44"/>
               </w:rPr>
-              <w:t xml:space="preserve">4</w:t>
+              <w:t xml:space="preserve">10</w:t>
             </w:r>
           </w:p>
         </w:tc>
@@ -4356,7 +4514,7 @@
           <w:sz w:val="18"/>
           <w:szCs w:val="18"/>
         </w:rPr>
-        <w:t xml:space="preserve">2 of the 94 rows are notes rather than passes — one records how the system is configured today, the other is a check that could not be run in this environment.</w:t>
+        <w:t xml:space="preserve">3 of the 114 rows are notes rather than passes — one records how the system is configured today, the other is a check that could not be run in this environment.</w:t>
       </w:r>
     </w:p>
     <w:p>
@@ -4931,6 +5089,642 @@
                 <w:szCs w:val="16"/>
               </w:rPr>
               <w:t xml:space="preserve">Fixed. All appointment arithmetic now stays in salon-local minutes-from-midnight and never converts to UTC.</w:t>
+            </w:r>
+          </w:p>
+        </w:tc>
+      </w:tr>
+      <w:tr>
+        <w:tc>
+          <w:tcPr>
+            <w:tcW w:type="dxa" w:w="700"/>
+            <w:tcMar>
+              <w:top w:type="dxa" w:w="70"/>
+              <w:left w:type="dxa" w:w="110"/>
+              <w:bottom w:type="dxa" w:w="70"/>
+              <w:right w:type="dxa" w:w="110"/>
+            </w:tcMar>
+          </w:tcPr>
+          <w:p>
+            <w:pPr>
+              <w:spacing w:after="0" w:before="0" w:line="250"/>
+            </w:pPr>
+            <w:r>
+              <w:rPr>
+                <w:rFonts w:ascii="Calibri" w:cs="Calibri" w:eastAsia="Calibri" w:hAnsi="Calibri"/>
+                <w:b/>
+                <w:bCs/>
+                <w:color w:val="111111"/>
+                <w:sz w:val="17"/>
+                <w:szCs w:val="17"/>
+              </w:rPr>
+              <w:t xml:space="preserve">D-5</w:t>
+            </w:r>
+          </w:p>
+        </w:tc>
+        <w:tc>
+          <w:tcPr>
+            <w:tcW w:type="dxa" w:w="1000"/>
+            <w:tcMar>
+              <w:top w:type="dxa" w:w="70"/>
+              <w:left w:type="dxa" w:w="110"/>
+              <w:bottom w:type="dxa" w:w="70"/>
+              <w:right w:type="dxa" w:w="110"/>
+            </w:tcMar>
+          </w:tcPr>
+          <w:p>
+            <w:pPr>
+              <w:spacing w:after="0" w:before="0" w:line="250"/>
+            </w:pPr>
+            <w:r>
+              <w:rPr>
+                <w:rFonts w:ascii="Calibri" w:cs="Calibri" w:eastAsia="Calibri" w:hAnsi="Calibri"/>
+                <w:b/>
+                <w:bCs/>
+                <w:color w:val="9B2C1F"/>
+                <w:sz w:val="17"/>
+                <w:szCs w:val="17"/>
+              </w:rPr>
+              <w:t xml:space="preserve">High</w:t>
+            </w:r>
+          </w:p>
+        </w:tc>
+        <w:tc>
+          <w:tcPr>
+            <w:tcW w:type="dxa" w:w="4326"/>
+            <w:tcMar>
+              <w:top w:type="dxa" w:w="70"/>
+              <w:left w:type="dxa" w:w="110"/>
+              <w:bottom w:type="dxa" w:w="70"/>
+              <w:right w:type="dxa" w:w="110"/>
+            </w:tcMar>
+          </w:tcPr>
+          <w:p>
+            <w:pPr>
+              <w:spacing w:after="0" w:before="0" w:line="250"/>
+            </w:pPr>
+            <w:r>
+              <w:rPr>
+                <w:rFonts w:ascii="Calibri" w:cs="Calibri" w:eastAsia="Calibri" w:hAnsi="Calibri"/>
+                <w:color w:val="111111"/>
+                <w:sz w:val="16"/>
+                <w:szCs w:val="16"/>
+              </w:rPr>
+              <w:t xml:space="preserve">The “Sign in with Google” button did nothing at all. It had no click handler and there was no OAuth code anywhere in the system, although the requirements ask for it.</w:t>
+            </w:r>
+          </w:p>
+        </w:tc>
+        <w:tc>
+          <w:tcPr>
+            <w:tcW w:type="dxa" w:w="3000"/>
+            <w:tcMar>
+              <w:top w:type="dxa" w:w="70"/>
+              <w:left w:type="dxa" w:w="110"/>
+              <w:bottom w:type="dxa" w:w="70"/>
+              <w:right w:type="dxa" w:w="110"/>
+            </w:tcMar>
+          </w:tcPr>
+          <w:p>
+            <w:pPr>
+              <w:spacing w:after="0" w:before="0" w:line="250"/>
+            </w:pPr>
+            <w:r>
+              <w:rPr>
+                <w:rFonts w:ascii="Calibri" w:cs="Calibri" w:eastAsia="Calibri" w:hAnsi="Calibri"/>
+                <w:color w:val="1E6B3A"/>
+                <w:sz w:val="16"/>
+                <w:szCs w:val="16"/>
+              </w:rPr>
+              <w:t xml:space="preserve">Built. Server-side authorization-code flow with state, PKCE and nonce, issuing the same secure session as the password login. Clients only — a Google account cannot reach the staff console.</w:t>
+            </w:r>
+          </w:p>
+        </w:tc>
+      </w:tr>
+      <w:tr>
+        <w:tc>
+          <w:tcPr>
+            <w:tcW w:type="dxa" w:w="700"/>
+            <w:tcMar>
+              <w:top w:type="dxa" w:w="70"/>
+              <w:left w:type="dxa" w:w="110"/>
+              <w:bottom w:type="dxa" w:w="70"/>
+              <w:right w:type="dxa" w:w="110"/>
+            </w:tcMar>
+          </w:tcPr>
+          <w:p>
+            <w:pPr>
+              <w:spacing w:after="0" w:before="0" w:line="250"/>
+            </w:pPr>
+            <w:r>
+              <w:rPr>
+                <w:rFonts w:ascii="Calibri" w:cs="Calibri" w:eastAsia="Calibri" w:hAnsi="Calibri"/>
+                <w:b/>
+                <w:bCs/>
+                <w:color w:val="111111"/>
+                <w:sz w:val="17"/>
+                <w:szCs w:val="17"/>
+              </w:rPr>
+              <w:t xml:space="preserve">D-6</w:t>
+            </w:r>
+          </w:p>
+        </w:tc>
+        <w:tc>
+          <w:tcPr>
+            <w:tcW w:type="dxa" w:w="1000"/>
+            <w:tcMar>
+              <w:top w:type="dxa" w:w="70"/>
+              <w:left w:type="dxa" w:w="110"/>
+              <w:bottom w:type="dxa" w:w="70"/>
+              <w:right w:type="dxa" w:w="110"/>
+            </w:tcMar>
+          </w:tcPr>
+          <w:p>
+            <w:pPr>
+              <w:spacing w:after="0" w:before="0" w:line="250"/>
+            </w:pPr>
+            <w:r>
+              <w:rPr>
+                <w:rFonts w:ascii="Calibri" w:cs="Calibri" w:eastAsia="Calibri" w:hAnsi="Calibri"/>
+                <w:b/>
+                <w:bCs/>
+                <w:color w:val="9B2C1F"/>
+                <w:sz w:val="17"/>
+                <w:szCs w:val="17"/>
+              </w:rPr>
+              <w:t xml:space="preserve">Medium</w:t>
+            </w:r>
+          </w:p>
+        </w:tc>
+        <w:tc>
+          <w:tcPr>
+            <w:tcW w:type="dxa" w:w="4326"/>
+            <w:tcMar>
+              <w:top w:type="dxa" w:w="70"/>
+              <w:left w:type="dxa" w:w="110"/>
+              <w:bottom w:type="dxa" w:w="70"/>
+              <w:right w:type="dxa" w:w="110"/>
+            </w:tcMar>
+          </w:tcPr>
+          <w:p>
+            <w:pPr>
+              <w:spacing w:after="0" w:before="0" w:line="250"/>
+            </w:pPr>
+            <w:r>
+              <w:rPr>
+                <w:rFonts w:ascii="Calibri" w:cs="Calibri" w:eastAsia="Calibri" w:hAnsi="Calibri"/>
+                <w:color w:val="111111"/>
+                <w:sz w:val="16"/>
+                <w:szCs w:val="16"/>
+              </w:rPr>
+              <w:t xml:space="preserve">The red “now” line on the calendar was fixed at 2:38 pm and ignored the salon’s timezone entirely — it was placeholder data from the design stage.</w:t>
+            </w:r>
+          </w:p>
+        </w:tc>
+        <w:tc>
+          <w:tcPr>
+            <w:tcW w:type="dxa" w:w="3000"/>
+            <w:tcMar>
+              <w:top w:type="dxa" w:w="70"/>
+              <w:left w:type="dxa" w:w="110"/>
+              <w:bottom w:type="dxa" w:w="70"/>
+              <w:right w:type="dxa" w:w="110"/>
+            </w:tcMar>
+          </w:tcPr>
+          <w:p>
+            <w:pPr>
+              <w:spacing w:after="0" w:before="0" w:line="250"/>
+            </w:pPr>
+            <w:r>
+              <w:rPr>
+                <w:rFonts w:ascii="Calibri" w:cs="Calibri" w:eastAsia="Calibri" w:hAnsi="Calibri"/>
+                <w:color w:val="1E6B3A"/>
+                <w:sz w:val="16"/>
+                <w:szCs w:val="16"/>
+              </w:rPr>
+              <w:t xml:space="preserve">Fixed. It reads Dubai time, moves every minute, and only appears when you are looking at today.</w:t>
+            </w:r>
+          </w:p>
+        </w:tc>
+      </w:tr>
+      <w:tr>
+        <w:tc>
+          <w:tcPr>
+            <w:tcW w:type="dxa" w:w="700"/>
+            <w:tcMar>
+              <w:top w:type="dxa" w:w="70"/>
+              <w:left w:type="dxa" w:w="110"/>
+              <w:bottom w:type="dxa" w:w="70"/>
+              <w:right w:type="dxa" w:w="110"/>
+            </w:tcMar>
+          </w:tcPr>
+          <w:p>
+            <w:pPr>
+              <w:spacing w:after="0" w:before="0" w:line="250"/>
+            </w:pPr>
+            <w:r>
+              <w:rPr>
+                <w:rFonts w:ascii="Calibri" w:cs="Calibri" w:eastAsia="Calibri" w:hAnsi="Calibri"/>
+                <w:b/>
+                <w:bCs/>
+                <w:color w:val="111111"/>
+                <w:sz w:val="17"/>
+                <w:szCs w:val="17"/>
+              </w:rPr>
+              <w:t xml:space="preserve">D-7</w:t>
+            </w:r>
+          </w:p>
+        </w:tc>
+        <w:tc>
+          <w:tcPr>
+            <w:tcW w:type="dxa" w:w="1000"/>
+            <w:tcMar>
+              <w:top w:type="dxa" w:w="70"/>
+              <w:left w:type="dxa" w:w="110"/>
+              <w:bottom w:type="dxa" w:w="70"/>
+              <w:right w:type="dxa" w:w="110"/>
+            </w:tcMar>
+          </w:tcPr>
+          <w:p>
+            <w:pPr>
+              <w:spacing w:after="0" w:before="0" w:line="250"/>
+            </w:pPr>
+            <w:r>
+              <w:rPr>
+                <w:rFonts w:ascii="Calibri" w:cs="Calibri" w:eastAsia="Calibri" w:hAnsi="Calibri"/>
+                <w:b/>
+                <w:bCs/>
+                <w:color w:val="9B2C1F"/>
+                <w:sz w:val="17"/>
+                <w:szCs w:val="17"/>
+              </w:rPr>
+              <w:t xml:space="preserve">Medium</w:t>
+            </w:r>
+          </w:p>
+        </w:tc>
+        <w:tc>
+          <w:tcPr>
+            <w:tcW w:type="dxa" w:w="4326"/>
+            <w:tcMar>
+              <w:top w:type="dxa" w:w="70"/>
+              <w:left w:type="dxa" w:w="110"/>
+              <w:bottom w:type="dxa" w:w="70"/>
+              <w:right w:type="dxa" w:w="110"/>
+            </w:tcMar>
+          </w:tcPr>
+          <w:p>
+            <w:pPr>
+              <w:spacing w:after="0" w:before="0" w:line="250"/>
+            </w:pPr>
+            <w:r>
+              <w:rPr>
+                <w:rFonts w:ascii="Calibri" w:cs="Calibri" w:eastAsia="Calibri" w:hAnsi="Calibri"/>
+                <w:color w:val="111111"/>
+                <w:sz w:val="16"/>
+                <w:szCs w:val="16"/>
+              </w:rPr>
+              <w:t xml:space="preserve">The calendar could only ever show today. Today, previous and next had no click handlers, so years of history in the database could not be reached from the screen.</w:t>
+            </w:r>
+          </w:p>
+        </w:tc>
+        <w:tc>
+          <w:tcPr>
+            <w:tcW w:type="dxa" w:w="3000"/>
+            <w:tcMar>
+              <w:top w:type="dxa" w:w="70"/>
+              <w:left w:type="dxa" w:w="110"/>
+              <w:bottom w:type="dxa" w:w="70"/>
+              <w:right w:type="dxa" w:w="110"/>
+            </w:tcMar>
+          </w:tcPr>
+          <w:p>
+            <w:pPr>
+              <w:spacing w:after="0" w:before="0" w:line="250"/>
+            </w:pPr>
+            <w:r>
+              <w:rPr>
+                <w:rFonts w:ascii="Calibri" w:cs="Calibri" w:eastAsia="Calibri" w:hAnsi="Calibri"/>
+                <w:color w:val="1E6B3A"/>
+                <w:sz w:val="16"/>
+                <w:szCs w:val="16"/>
+              </w:rPr>
+              <w:t xml:space="preserve">Fixed. The arrows step day by day, the date is a picker, and a month view shows counts and takings per day.</w:t>
+            </w:r>
+          </w:p>
+        </w:tc>
+      </w:tr>
+      <w:tr>
+        <w:tc>
+          <w:tcPr>
+            <w:tcW w:type="dxa" w:w="700"/>
+            <w:tcMar>
+              <w:top w:type="dxa" w:w="70"/>
+              <w:left w:type="dxa" w:w="110"/>
+              <w:bottom w:type="dxa" w:w="70"/>
+              <w:right w:type="dxa" w:w="110"/>
+            </w:tcMar>
+          </w:tcPr>
+          <w:p>
+            <w:pPr>
+              <w:spacing w:after="0" w:before="0" w:line="250"/>
+            </w:pPr>
+            <w:r>
+              <w:rPr>
+                <w:rFonts w:ascii="Calibri" w:cs="Calibri" w:eastAsia="Calibri" w:hAnsi="Calibri"/>
+                <w:b/>
+                <w:bCs/>
+                <w:color w:val="111111"/>
+                <w:sz w:val="17"/>
+                <w:szCs w:val="17"/>
+              </w:rPr>
+              <w:t xml:space="preserve">D-8</w:t>
+            </w:r>
+          </w:p>
+        </w:tc>
+        <w:tc>
+          <w:tcPr>
+            <w:tcW w:type="dxa" w:w="1000"/>
+            <w:tcMar>
+              <w:top w:type="dxa" w:w="70"/>
+              <w:left w:type="dxa" w:w="110"/>
+              <w:bottom w:type="dxa" w:w="70"/>
+              <w:right w:type="dxa" w:w="110"/>
+            </w:tcMar>
+          </w:tcPr>
+          <w:p>
+            <w:pPr>
+              <w:spacing w:after="0" w:before="0" w:line="250"/>
+            </w:pPr>
+            <w:r>
+              <w:rPr>
+                <w:rFonts w:ascii="Calibri" w:cs="Calibri" w:eastAsia="Calibri" w:hAnsi="Calibri"/>
+                <w:b/>
+                <w:bCs/>
+                <w:color w:val="9B2C1F"/>
+                <w:sz w:val="17"/>
+                <w:szCs w:val="17"/>
+              </w:rPr>
+              <w:t xml:space="preserve">Medium</w:t>
+            </w:r>
+          </w:p>
+        </w:tc>
+        <w:tc>
+          <w:tcPr>
+            <w:tcW w:type="dxa" w:w="4326"/>
+            <w:tcMar>
+              <w:top w:type="dxa" w:w="70"/>
+              <w:left w:type="dxa" w:w="110"/>
+              <w:bottom w:type="dxa" w:w="70"/>
+              <w:right w:type="dxa" w:w="110"/>
+            </w:tcMar>
+          </w:tcPr>
+          <w:p>
+            <w:pPr>
+              <w:spacing w:after="0" w:before="0" w:line="250"/>
+            </w:pPr>
+            <w:r>
+              <w:rPr>
+                <w:rFonts w:ascii="Calibri" w:cs="Calibri" w:eastAsia="Calibri" w:hAnsi="Calibri"/>
+                <w:color w:val="111111"/>
+                <w:sz w:val="16"/>
+                <w:szCs w:val="16"/>
+              </w:rPr>
+              <w:t xml:space="preserve">Walk-in clients could not be opened. Having no account, their row was not clickable — and most of the client book is walk-ins.</w:t>
+            </w:r>
+          </w:p>
+        </w:tc>
+        <w:tc>
+          <w:tcPr>
+            <w:tcW w:type="dxa" w:w="3000"/>
+            <w:tcMar>
+              <w:top w:type="dxa" w:w="70"/>
+              <w:left w:type="dxa" w:w="110"/>
+              <w:bottom w:type="dxa" w:w="70"/>
+              <w:right w:type="dxa" w:w="110"/>
+            </w:tcMar>
+          </w:tcPr>
+          <w:p>
+            <w:pPr>
+              <w:spacing w:after="0" w:before="0" w:line="250"/>
+            </w:pPr>
+            <w:r>
+              <w:rPr>
+                <w:rFonts w:ascii="Calibri" w:cs="Calibri" w:eastAsia="Calibri" w:hAnsi="Calibri"/>
+                <w:color w:val="1E6B3A"/>
+                <w:sz w:val="16"/>
+                <w:szCs w:val="16"/>
+              </w:rPr>
+              <w:t xml:space="preserve">Fixed. Walk-ins open with their full visit history, and one press files them as a client record with every past visit attached.</w:t>
+            </w:r>
+          </w:p>
+        </w:tc>
+      </w:tr>
+      <w:tr>
+        <w:tc>
+          <w:tcPr>
+            <w:tcW w:type="dxa" w:w="700"/>
+            <w:tcMar>
+              <w:top w:type="dxa" w:w="70"/>
+              <w:left w:type="dxa" w:w="110"/>
+              <w:bottom w:type="dxa" w:w="70"/>
+              <w:right w:type="dxa" w:w="110"/>
+            </w:tcMar>
+          </w:tcPr>
+          <w:p>
+            <w:pPr>
+              <w:spacing w:after="0" w:before="0" w:line="250"/>
+            </w:pPr>
+            <w:r>
+              <w:rPr>
+                <w:rFonts w:ascii="Calibri" w:cs="Calibri" w:eastAsia="Calibri" w:hAnsi="Calibri"/>
+                <w:b/>
+                <w:bCs/>
+                <w:color w:val="111111"/>
+                <w:sz w:val="17"/>
+                <w:szCs w:val="17"/>
+              </w:rPr>
+              <w:t xml:space="preserve">D-9</w:t>
+            </w:r>
+          </w:p>
+        </w:tc>
+        <w:tc>
+          <w:tcPr>
+            <w:tcW w:type="dxa" w:w="1000"/>
+            <w:tcMar>
+              <w:top w:type="dxa" w:w="70"/>
+              <w:left w:type="dxa" w:w="110"/>
+              <w:bottom w:type="dxa" w:w="70"/>
+              <w:right w:type="dxa" w:w="110"/>
+            </w:tcMar>
+          </w:tcPr>
+          <w:p>
+            <w:pPr>
+              <w:spacing w:after="0" w:before="0" w:line="250"/>
+            </w:pPr>
+            <w:r>
+              <w:rPr>
+                <w:rFonts w:ascii="Calibri" w:cs="Calibri" w:eastAsia="Calibri" w:hAnsi="Calibri"/>
+                <w:b/>
+                <w:bCs/>
+                <w:color w:val="9B2C1F"/>
+                <w:sz w:val="17"/>
+                <w:szCs w:val="17"/>
+              </w:rPr>
+              <w:t xml:space="preserve">Low</w:t>
+            </w:r>
+          </w:p>
+        </w:tc>
+        <w:tc>
+          <w:tcPr>
+            <w:tcW w:type="dxa" w:w="4326"/>
+            <w:tcMar>
+              <w:top w:type="dxa" w:w="70"/>
+              <w:left w:type="dxa" w:w="110"/>
+              <w:bottom w:type="dxa" w:w="70"/>
+              <w:right w:type="dxa" w:w="110"/>
+            </w:tcMar>
+          </w:tcPr>
+          <w:p>
+            <w:pPr>
+              <w:spacing w:after="0" w:before="0" w:line="250"/>
+            </w:pPr>
+            <w:r>
+              <w:rPr>
+                <w:rFonts w:ascii="Calibri" w:cs="Calibri" w:eastAsia="Calibri" w:hAnsi="Calibri"/>
+                <w:color w:val="111111"/>
+                <w:sz w:val="16"/>
+                <w:szCs w:val="16"/>
+              </w:rPr>
+              <w:t xml:space="preserve">The console showed every tab while the session was still loading, and all of them when signed out.</w:t>
+            </w:r>
+          </w:p>
+        </w:tc>
+        <w:tc>
+          <w:tcPr>
+            <w:tcW w:type="dxa" w:w="3000"/>
+            <w:tcMar>
+              <w:top w:type="dxa" w:w="70"/>
+              <w:left w:type="dxa" w:w="110"/>
+              <w:bottom w:type="dxa" w:w="70"/>
+              <w:right w:type="dxa" w:w="110"/>
+            </w:tcMar>
+          </w:tcPr>
+          <w:p>
+            <w:pPr>
+              <w:spacing w:after="0" w:before="0" w:line="250"/>
+            </w:pPr>
+            <w:r>
+              <w:rPr>
+                <w:rFonts w:ascii="Calibri" w:cs="Calibri" w:eastAsia="Calibri" w:hAnsi="Calibri"/>
+                <w:color w:val="1E6B3A"/>
+                <w:sz w:val="16"/>
+                <w:szCs w:val="16"/>
+              </w:rPr>
+              <w:t xml:space="preserve">Fixed. Only permitted tabs are drawn, and the view resets if the role changes.</w:t>
+            </w:r>
+          </w:p>
+        </w:tc>
+      </w:tr>
+      <w:tr>
+        <w:tc>
+          <w:tcPr>
+            <w:tcW w:type="dxa" w:w="700"/>
+            <w:tcMar>
+              <w:top w:type="dxa" w:w="70"/>
+              <w:left w:type="dxa" w:w="110"/>
+              <w:bottom w:type="dxa" w:w="70"/>
+              <w:right w:type="dxa" w:w="110"/>
+            </w:tcMar>
+          </w:tcPr>
+          <w:p>
+            <w:pPr>
+              <w:spacing w:after="0" w:before="0" w:line="250"/>
+            </w:pPr>
+            <w:r>
+              <w:rPr>
+                <w:rFonts w:ascii="Calibri" w:cs="Calibri" w:eastAsia="Calibri" w:hAnsi="Calibri"/>
+                <w:b/>
+                <w:bCs/>
+                <w:color w:val="111111"/>
+                <w:sz w:val="17"/>
+                <w:szCs w:val="17"/>
+              </w:rPr>
+              <w:t xml:space="preserve">D-10</w:t>
+            </w:r>
+          </w:p>
+        </w:tc>
+        <w:tc>
+          <w:tcPr>
+            <w:tcW w:type="dxa" w:w="1000"/>
+            <w:tcMar>
+              <w:top w:type="dxa" w:w="70"/>
+              <w:left w:type="dxa" w:w="110"/>
+              <w:bottom w:type="dxa" w:w="70"/>
+              <w:right w:type="dxa" w:w="110"/>
+            </w:tcMar>
+          </w:tcPr>
+          <w:p>
+            <w:pPr>
+              <w:spacing w:after="0" w:before="0" w:line="250"/>
+            </w:pPr>
+            <w:r>
+              <w:rPr>
+                <w:rFonts w:ascii="Calibri" w:cs="Calibri" w:eastAsia="Calibri" w:hAnsi="Calibri"/>
+                <w:b/>
+                <w:bCs/>
+                <w:color w:val="9B2C1F"/>
+                <w:sz w:val="17"/>
+                <w:szCs w:val="17"/>
+              </w:rPr>
+              <w:t xml:space="preserve">Low</w:t>
+            </w:r>
+          </w:p>
+        </w:tc>
+        <w:tc>
+          <w:tcPr>
+            <w:tcW w:type="dxa" w:w="4326"/>
+            <w:tcMar>
+              <w:top w:type="dxa" w:w="70"/>
+              <w:left w:type="dxa" w:w="110"/>
+              <w:bottom w:type="dxa" w:w="70"/>
+              <w:right w:type="dxa" w:w="110"/>
+            </w:tcMar>
+          </w:tcPr>
+          <w:p>
+            <w:pPr>
+              <w:spacing w:after="0" w:before="0" w:line="250"/>
+            </w:pPr>
+            <w:r>
+              <w:rPr>
+                <w:rFonts w:ascii="Calibri" w:cs="Calibri" w:eastAsia="Calibri" w:hAnsi="Calibri"/>
+                <w:color w:val="111111"/>
+                <w:sz w:val="16"/>
+                <w:szCs w:val="16"/>
+              </w:rPr>
+              <w:t xml:space="preserve">Barbers were labelled Master, Senior and plain Barber, and the site claimed 12 of them. The requirements define one barber role and there are nine.</w:t>
+            </w:r>
+          </w:p>
+        </w:tc>
+        <w:tc>
+          <w:tcPr>
+            <w:tcW w:type="dxa" w:w="3000"/>
+            <w:tcMar>
+              <w:top w:type="dxa" w:w="70"/>
+              <w:left w:type="dxa" w:w="110"/>
+              <w:bottom w:type="dxa" w:w="70"/>
+              <w:right w:type="dxa" w:w="110"/>
+            </w:tcMar>
+          </w:tcPr>
+          <w:p>
+            <w:pPr>
+              <w:spacing w:after="0" w:before="0" w:line="250"/>
+            </w:pPr>
+            <w:r>
+              <w:rPr>
+                <w:rFonts w:ascii="Calibri" w:cs="Calibri" w:eastAsia="Calibri" w:hAnsi="Calibri"/>
+                <w:color w:val="1E6B3A"/>
+                <w:sz w:val="16"/>
+                <w:szCs w:val="16"/>
+              </w:rPr>
+              <w:t xml:space="preserve">Fixed. Every barber is simply “Barber”, and the count is correct.</w:t>
             </w:r>
           </w:p>
         </w:tc>
@@ -22337,6 +23131,3822 @@
           <w:sz w:val="24"/>
           <w:szCs w:val="24"/>
         </w:rPr>
+        <w:t xml:space="preserve">P · Signing up and signing in as a client</w:t>
+      </w:r>
+    </w:p>
+    <w:p>
+      <w:pPr>
+        <w:spacing w:after="140" w:before="0" w:line="260"/>
+      </w:pPr>
+      <w:r>
+        <w:rPr>
+          <w:rFonts w:ascii="Calibri" w:cs="Calibri" w:eastAsia="Calibri" w:hAnsi="Calibri"/>
+          <w:color w:val="6B6B6B"/>
+          <w:sz w:val="18"/>
+          <w:szCs w:val="18"/>
+        </w:rPr>
+        <w:t xml:space="preserve">Clients can register with their own details or use Google. Google is for clients only — staff always use the keypad in the salon, and a Google account cannot reach the console.</w:t>
+      </w:r>
+    </w:p>
+    <w:tbl>
+      <w:tblPr>
+        <w:tblW w:type="dxa" w:w="9026"/>
+        <w:tblBorders>
+          <w:top w:val="single" w:color="D8D4C8" w:sz="2"/>
+          <w:left w:val="none"/>
+          <w:bottom w:val="single" w:color="D8D4C8" w:sz="2"/>
+          <w:right w:val="none"/>
+          <w:insideH w:val="single" w:color="D8D4C8" w:sz="2"/>
+          <w:insideV w:val="none"/>
+        </w:tblBorders>
+      </w:tblPr>
+      <w:tblGrid>
+        <w:gridCol w:w="520"/>
+        <w:gridCol w:w="2280"/>
+        <w:gridCol w:w="1960"/>
+        <w:gridCol w:w="3116"/>
+        <w:gridCol w:w="560"/>
+        <w:gridCol w:w="590"/>
+      </w:tblGrid>
+      <w:tr>
+        <w:trPr>
+          <w:tblHeader/>
+        </w:trPr>
+        <w:tc>
+          <w:tcPr>
+            <w:tcW w:type="dxa" w:w="520"/>
+            <w:shd w:fill="111111" w:color="auto" w:val="clear"/>
+            <w:tcMar>
+              <w:top w:type="dxa" w:w="70"/>
+              <w:left w:type="dxa" w:w="110"/>
+              <w:bottom w:type="dxa" w:w="70"/>
+              <w:right w:type="dxa" w:w="110"/>
+            </w:tcMar>
+          </w:tcPr>
+          <w:p>
+            <w:pPr>
+              <w:spacing w:after="0" w:before="0" w:line="250"/>
+            </w:pPr>
+            <w:r>
+              <w:rPr>
+                <w:rFonts w:ascii="Calibri" w:cs="Calibri" w:eastAsia="Calibri" w:hAnsi="Calibri"/>
+                <w:b/>
+                <w:bCs/>
+                <w:color w:val="FFFFFF"/>
+                <w:sz w:val="16"/>
+                <w:szCs w:val="16"/>
+              </w:rPr>
+              <w:t xml:space="preserve">#</w:t>
+            </w:r>
+          </w:p>
+        </w:tc>
+        <w:tc>
+          <w:tcPr>
+            <w:tcW w:type="dxa" w:w="2280"/>
+            <w:shd w:fill="111111" w:color="auto" w:val="clear"/>
+            <w:tcMar>
+              <w:top w:type="dxa" w:w="70"/>
+              <w:left w:type="dxa" w:w="110"/>
+              <w:bottom w:type="dxa" w:w="70"/>
+              <w:right w:type="dxa" w:w="110"/>
+            </w:tcMar>
+          </w:tcPr>
+          <w:p>
+            <w:pPr>
+              <w:spacing w:after="0" w:before="0" w:line="250"/>
+            </w:pPr>
+            <w:r>
+              <w:rPr>
+                <w:rFonts w:ascii="Calibri" w:cs="Calibri" w:eastAsia="Calibri" w:hAnsi="Calibri"/>
+                <w:b/>
+                <w:bCs/>
+                <w:color w:val="FFFFFF"/>
+                <w:sz w:val="16"/>
+                <w:szCs w:val="16"/>
+              </w:rPr>
+              <w:t xml:space="preserve">What to do</w:t>
+            </w:r>
+          </w:p>
+        </w:tc>
+        <w:tc>
+          <w:tcPr>
+            <w:tcW w:type="dxa" w:w="1960"/>
+            <w:shd w:fill="111111" w:color="auto" w:val="clear"/>
+            <w:tcMar>
+              <w:top w:type="dxa" w:w="70"/>
+              <w:left w:type="dxa" w:w="110"/>
+              <w:bottom w:type="dxa" w:w="70"/>
+              <w:right w:type="dxa" w:w="110"/>
+            </w:tcMar>
+          </w:tcPr>
+          <w:p>
+            <w:pPr>
+              <w:spacing w:after="0" w:before="0" w:line="250"/>
+            </w:pPr>
+            <w:r>
+              <w:rPr>
+                <w:rFonts w:ascii="Calibri" w:cs="Calibri" w:eastAsia="Calibri" w:hAnsi="Calibri"/>
+                <w:b/>
+                <w:bCs/>
+                <w:color w:val="FFFFFF"/>
+                <w:sz w:val="16"/>
+                <w:szCs w:val="16"/>
+              </w:rPr>
+              <w:t xml:space="preserve">What should happen</w:t>
+            </w:r>
+          </w:p>
+        </w:tc>
+        <w:tc>
+          <w:tcPr>
+            <w:tcW w:type="dxa" w:w="3116"/>
+            <w:shd w:fill="111111" w:color="auto" w:val="clear"/>
+            <w:tcMar>
+              <w:top w:type="dxa" w:w="70"/>
+              <w:left w:type="dxa" w:w="110"/>
+              <w:bottom w:type="dxa" w:w="70"/>
+              <w:right w:type="dxa" w:w="110"/>
+            </w:tcMar>
+          </w:tcPr>
+          <w:p>
+            <w:pPr>
+              <w:spacing w:after="0" w:before="0" w:line="250"/>
+            </w:pPr>
+            <w:r>
+              <w:rPr>
+                <w:rFonts w:ascii="Calibri" w:cs="Calibri" w:eastAsia="Calibri" w:hAnsi="Calibri"/>
+                <w:b/>
+                <w:bCs/>
+                <w:color w:val="FFFFFF"/>
+                <w:sz w:val="16"/>
+                <w:szCs w:val="16"/>
+              </w:rPr>
+              <w:t xml:space="preserve">What happened on 18–19 </w:t>
+            </w:r>
+          </w:p>
+        </w:tc>
+        <w:tc>
+          <w:tcPr>
+            <w:tcW w:type="dxa" w:w="560"/>
+            <w:shd w:fill="111111" w:color="auto" w:val="clear"/>
+            <w:tcMar>
+              <w:top w:type="dxa" w:w="70"/>
+              <w:left w:type="dxa" w:w="110"/>
+              <w:bottom w:type="dxa" w:w="70"/>
+              <w:right w:type="dxa" w:w="110"/>
+            </w:tcMar>
+          </w:tcPr>
+          <w:p>
+            <w:pPr>
+              <w:spacing w:after="0" w:before="0" w:line="250"/>
+            </w:pPr>
+            <w:r>
+              <w:rPr>
+                <w:rFonts w:ascii="Calibri" w:cs="Calibri" w:eastAsia="Calibri" w:hAnsi="Calibri"/>
+                <w:b/>
+                <w:bCs/>
+                <w:color w:val="FFFFFF"/>
+                <w:sz w:val="16"/>
+                <w:szCs w:val="16"/>
+              </w:rPr>
+              <w:t xml:space="preserve">Run</w:t>
+            </w:r>
+          </w:p>
+        </w:tc>
+        <w:tc>
+          <w:tcPr>
+            <w:tcW w:type="dxa" w:w="590"/>
+            <w:shd w:fill="111111" w:color="auto" w:val="clear"/>
+            <w:tcMar>
+              <w:top w:type="dxa" w:w="70"/>
+              <w:left w:type="dxa" w:w="110"/>
+              <w:bottom w:type="dxa" w:w="70"/>
+              <w:right w:type="dxa" w:w="110"/>
+            </w:tcMar>
+          </w:tcPr>
+          <w:p>
+            <w:pPr>
+              <w:spacing w:after="0" w:before="0" w:line="250"/>
+            </w:pPr>
+            <w:r>
+              <w:rPr>
+                <w:rFonts w:ascii="Calibri" w:cs="Calibri" w:eastAsia="Calibri" w:hAnsi="Calibri"/>
+                <w:b/>
+                <w:bCs/>
+                <w:color w:val="FFFFFF"/>
+                <w:sz w:val="16"/>
+                <w:szCs w:val="16"/>
+              </w:rPr>
+              <w:t xml:space="preserve">Tick</w:t>
+            </w:r>
+          </w:p>
+        </w:tc>
+      </w:tr>
+      <w:tr>
+        <w:tc>
+          <w:tcPr>
+            <w:tcW w:type="dxa" w:w="520"/>
+            <w:tcMar>
+              <w:top w:type="dxa" w:w="70"/>
+              <w:left w:type="dxa" w:w="110"/>
+              <w:bottom w:type="dxa" w:w="70"/>
+              <w:right w:type="dxa" w:w="110"/>
+            </w:tcMar>
+          </w:tcPr>
+          <w:p>
+            <w:pPr>
+              <w:spacing w:after="0" w:before="0" w:line="250"/>
+            </w:pPr>
+            <w:r>
+              <w:rPr>
+                <w:rFonts w:ascii="Calibri" w:cs="Calibri" w:eastAsia="Calibri" w:hAnsi="Calibri"/>
+                <w:b/>
+                <w:bCs/>
+                <w:color w:val="111111"/>
+                <w:sz w:val="16"/>
+                <w:szCs w:val="16"/>
+              </w:rPr>
+              <w:t xml:space="preserve">P1</w:t>
+            </w:r>
+          </w:p>
+        </w:tc>
+        <w:tc>
+          <w:tcPr>
+            <w:tcW w:type="dxa" w:w="2280"/>
+            <w:tcMar>
+              <w:top w:type="dxa" w:w="70"/>
+              <w:left w:type="dxa" w:w="110"/>
+              <w:bottom w:type="dxa" w:w="70"/>
+              <w:right w:type="dxa" w:w="110"/>
+            </w:tcMar>
+          </w:tcPr>
+          <w:p>
+            <w:pPr>
+              <w:spacing w:after="0" w:before="0" w:line="250"/>
+            </w:pPr>
+            <w:r>
+              <w:rPr>
+                <w:rFonts w:ascii="Calibri" w:cs="Calibri" w:eastAsia="Calibri" w:hAnsi="Calibri"/>
+                <w:color w:val="111111"/>
+                <w:sz w:val="16"/>
+                <w:szCs w:val="16"/>
+              </w:rPr>
+              <w:t xml:space="preserve">Open /login and choose Create account.</w:t>
+            </w:r>
+          </w:p>
+        </w:tc>
+        <w:tc>
+          <w:tcPr>
+            <w:tcW w:type="dxa" w:w="1960"/>
+            <w:tcMar>
+              <w:top w:type="dxa" w:w="70"/>
+              <w:left w:type="dxa" w:w="110"/>
+              <w:bottom w:type="dxa" w:w="70"/>
+              <w:right w:type="dxa" w:w="110"/>
+            </w:tcMar>
+          </w:tcPr>
+          <w:p>
+            <w:pPr>
+              <w:spacing w:after="0" w:before="0" w:line="250"/>
+            </w:pPr>
+            <w:r>
+              <w:rPr>
+                <w:rFonts w:ascii="Calibri" w:cs="Calibri" w:eastAsia="Calibri" w:hAnsi="Calibri"/>
+                <w:color w:val="111111"/>
+                <w:sz w:val="16"/>
+                <w:szCs w:val="16"/>
+              </w:rPr>
+              <w:t xml:space="preserve">Asks for name, email, mobile, a user ID and a password.</w:t>
+            </w:r>
+          </w:p>
+        </w:tc>
+        <w:tc>
+          <w:tcPr>
+            <w:tcW w:type="dxa" w:w="3116"/>
+            <w:tcMar>
+              <w:top w:type="dxa" w:w="70"/>
+              <w:left w:type="dxa" w:w="110"/>
+              <w:bottom w:type="dxa" w:w="70"/>
+              <w:right w:type="dxa" w:w="110"/>
+            </w:tcMar>
+          </w:tcPr>
+          <w:p>
+            <w:pPr>
+              <w:spacing w:after="0" w:before="0" w:line="250"/>
+            </w:pPr>
+            <w:r>
+              <w:rPr>
+                <w:rFonts w:ascii="Calibri" w:cs="Calibri" w:eastAsia="Calibri" w:hAnsi="Calibri"/>
+                <w:color w:val="111111"/>
+                <w:sz w:val="16"/>
+                <w:szCs w:val="16"/>
+              </w:rPr>
+              <w:t xml:space="preserve">All five present. Email and mobile are required.</w:t>
+            </w:r>
+          </w:p>
+        </w:tc>
+        <w:tc>
+          <w:tcPr>
+            <w:tcW w:type="dxa" w:w="560"/>
+            <w:tcMar>
+              <w:top w:type="dxa" w:w="70"/>
+              <w:left w:type="dxa" w:w="110"/>
+              <w:bottom w:type="dxa" w:w="70"/>
+              <w:right w:type="dxa" w:w="110"/>
+            </w:tcMar>
+          </w:tcPr>
+          <w:p>
+            <w:pPr>
+              <w:spacing w:after="0" w:before="0" w:line="250"/>
+              <w:jc w:val="center"/>
+            </w:pPr>
+            <w:r>
+              <w:rPr>
+                <w:rFonts w:ascii="Calibri" w:cs="Calibri" w:eastAsia="Calibri" w:hAnsi="Calibri"/>
+                <w:b/>
+                <w:bCs/>
+                <w:color w:val="1E6B3A"/>
+                <w:sz w:val="15"/>
+                <w:szCs w:val="15"/>
+              </w:rPr>
+              <w:t xml:space="preserve">Pass</w:t>
+            </w:r>
+          </w:p>
+        </w:tc>
+        <w:tc>
+          <w:tcPr>
+            <w:tcW w:type="dxa" w:w="590"/>
+            <w:tcMar>
+              <w:top w:type="dxa" w:w="70"/>
+              <w:left w:type="dxa" w:w="110"/>
+              <w:bottom w:type="dxa" w:w="70"/>
+              <w:right w:type="dxa" w:w="110"/>
+            </w:tcMar>
+          </w:tcPr>
+          <w:p>
+            <w:pPr>
+              <w:spacing w:after="0" w:before="0" w:line="250"/>
+            </w:pPr>
+            <w:r>
+              <w:rPr>
+                <w:rFonts w:ascii="Calibri" w:cs="Calibri" w:eastAsia="Calibri" w:hAnsi="Calibri"/>
+                <w:color w:val="111111"/>
+                <w:sz w:val="17"/>
+                <w:szCs w:val="17"/>
+              </w:rPr>
+              <w:t xml:space="preserve"> </w:t>
+            </w:r>
+          </w:p>
+        </w:tc>
+      </w:tr>
+      <w:tr>
+        <w:tc>
+          <w:tcPr>
+            <w:tcW w:type="dxa" w:w="520"/>
+            <w:tcMar>
+              <w:top w:type="dxa" w:w="70"/>
+              <w:left w:type="dxa" w:w="110"/>
+              <w:bottom w:type="dxa" w:w="70"/>
+              <w:right w:type="dxa" w:w="110"/>
+            </w:tcMar>
+          </w:tcPr>
+          <w:p>
+            <w:pPr>
+              <w:spacing w:after="0" w:before="0" w:line="250"/>
+            </w:pPr>
+            <w:r>
+              <w:rPr>
+                <w:rFonts w:ascii="Calibri" w:cs="Calibri" w:eastAsia="Calibri" w:hAnsi="Calibri"/>
+                <w:b/>
+                <w:bCs/>
+                <w:color w:val="111111"/>
+                <w:sz w:val="16"/>
+                <w:szCs w:val="16"/>
+              </w:rPr>
+              <w:t xml:space="preserve">P2</w:t>
+            </w:r>
+          </w:p>
+        </w:tc>
+        <w:tc>
+          <w:tcPr>
+            <w:tcW w:type="dxa" w:w="2280"/>
+            <w:tcMar>
+              <w:top w:type="dxa" w:w="70"/>
+              <w:left w:type="dxa" w:w="110"/>
+              <w:bottom w:type="dxa" w:w="70"/>
+              <w:right w:type="dxa" w:w="110"/>
+            </w:tcMar>
+          </w:tcPr>
+          <w:p>
+            <w:pPr>
+              <w:spacing w:after="0" w:before="0" w:line="250"/>
+            </w:pPr>
+            <w:r>
+              <w:rPr>
+                <w:rFonts w:ascii="Calibri" w:cs="Calibri" w:eastAsia="Calibri" w:hAnsi="Calibri"/>
+                <w:color w:val="111111"/>
+                <w:sz w:val="16"/>
+                <w:szCs w:val="16"/>
+              </w:rPr>
+              <w:t xml:space="preserve">Try to register without an email.</w:t>
+            </w:r>
+          </w:p>
+        </w:tc>
+        <w:tc>
+          <w:tcPr>
+            <w:tcW w:type="dxa" w:w="1960"/>
+            <w:tcMar>
+              <w:top w:type="dxa" w:w="70"/>
+              <w:left w:type="dxa" w:w="110"/>
+              <w:bottom w:type="dxa" w:w="70"/>
+              <w:right w:type="dxa" w:w="110"/>
+            </w:tcMar>
+          </w:tcPr>
+          <w:p>
+            <w:pPr>
+              <w:spacing w:after="0" w:before="0" w:line="250"/>
+            </w:pPr>
+            <w:r>
+              <w:rPr>
+                <w:rFonts w:ascii="Calibri" w:cs="Calibri" w:eastAsia="Calibri" w:hAnsi="Calibri"/>
+                <w:color w:val="111111"/>
+                <w:sz w:val="16"/>
+                <w:szCs w:val="16"/>
+              </w:rPr>
+              <w:t xml:space="preserve">Refused.</w:t>
+            </w:r>
+          </w:p>
+        </w:tc>
+        <w:tc>
+          <w:tcPr>
+            <w:tcW w:type="dxa" w:w="3116"/>
+            <w:tcMar>
+              <w:top w:type="dxa" w:w="70"/>
+              <w:left w:type="dxa" w:w="110"/>
+              <w:bottom w:type="dxa" w:w="70"/>
+              <w:right w:type="dxa" w:w="110"/>
+            </w:tcMar>
+          </w:tcPr>
+          <w:p>
+            <w:pPr>
+              <w:spacing w:after="0" w:before="0" w:line="250"/>
+            </w:pPr>
+            <w:r>
+              <w:rPr>
+                <w:rFonts w:ascii="Calibri" w:cs="Calibri" w:eastAsia="Calibri" w:hAnsi="Calibri"/>
+                <w:color w:val="111111"/>
+                <w:sz w:val="16"/>
+                <w:szCs w:val="16"/>
+              </w:rPr>
+              <w:t xml:space="preserve">HTTP 400.</w:t>
+            </w:r>
+          </w:p>
+        </w:tc>
+        <w:tc>
+          <w:tcPr>
+            <w:tcW w:type="dxa" w:w="560"/>
+            <w:tcMar>
+              <w:top w:type="dxa" w:w="70"/>
+              <w:left w:type="dxa" w:w="110"/>
+              <w:bottom w:type="dxa" w:w="70"/>
+              <w:right w:type="dxa" w:w="110"/>
+            </w:tcMar>
+          </w:tcPr>
+          <w:p>
+            <w:pPr>
+              <w:spacing w:after="0" w:before="0" w:line="250"/>
+              <w:jc w:val="center"/>
+            </w:pPr>
+            <w:r>
+              <w:rPr>
+                <w:rFonts w:ascii="Calibri" w:cs="Calibri" w:eastAsia="Calibri" w:hAnsi="Calibri"/>
+                <w:b/>
+                <w:bCs/>
+                <w:color w:val="1E6B3A"/>
+                <w:sz w:val="15"/>
+                <w:szCs w:val="15"/>
+              </w:rPr>
+              <w:t xml:space="preserve">Pass</w:t>
+            </w:r>
+          </w:p>
+        </w:tc>
+        <w:tc>
+          <w:tcPr>
+            <w:tcW w:type="dxa" w:w="590"/>
+            <w:tcMar>
+              <w:top w:type="dxa" w:w="70"/>
+              <w:left w:type="dxa" w:w="110"/>
+              <w:bottom w:type="dxa" w:w="70"/>
+              <w:right w:type="dxa" w:w="110"/>
+            </w:tcMar>
+          </w:tcPr>
+          <w:p>
+            <w:pPr>
+              <w:spacing w:after="0" w:before="0" w:line="250"/>
+            </w:pPr>
+            <w:r>
+              <w:rPr>
+                <w:rFonts w:ascii="Calibri" w:cs="Calibri" w:eastAsia="Calibri" w:hAnsi="Calibri"/>
+                <w:color w:val="111111"/>
+                <w:sz w:val="17"/>
+                <w:szCs w:val="17"/>
+              </w:rPr>
+              <w:t xml:space="preserve"> </w:t>
+            </w:r>
+          </w:p>
+        </w:tc>
+      </w:tr>
+      <w:tr>
+        <w:tc>
+          <w:tcPr>
+            <w:tcW w:type="dxa" w:w="520"/>
+            <w:tcMar>
+              <w:top w:type="dxa" w:w="70"/>
+              <w:left w:type="dxa" w:w="110"/>
+              <w:bottom w:type="dxa" w:w="70"/>
+              <w:right w:type="dxa" w:w="110"/>
+            </w:tcMar>
+          </w:tcPr>
+          <w:p>
+            <w:pPr>
+              <w:spacing w:after="0" w:before="0" w:line="250"/>
+            </w:pPr>
+            <w:r>
+              <w:rPr>
+                <w:rFonts w:ascii="Calibri" w:cs="Calibri" w:eastAsia="Calibri" w:hAnsi="Calibri"/>
+                <w:b/>
+                <w:bCs/>
+                <w:color w:val="111111"/>
+                <w:sz w:val="16"/>
+                <w:szCs w:val="16"/>
+              </w:rPr>
+              <w:t xml:space="preserve">P3</w:t>
+            </w:r>
+          </w:p>
+        </w:tc>
+        <w:tc>
+          <w:tcPr>
+            <w:tcW w:type="dxa" w:w="2280"/>
+            <w:tcMar>
+              <w:top w:type="dxa" w:w="70"/>
+              <w:left w:type="dxa" w:w="110"/>
+              <w:bottom w:type="dxa" w:w="70"/>
+              <w:right w:type="dxa" w:w="110"/>
+            </w:tcMar>
+          </w:tcPr>
+          <w:p>
+            <w:pPr>
+              <w:spacing w:after="0" w:before="0" w:line="250"/>
+            </w:pPr>
+            <w:r>
+              <w:rPr>
+                <w:rFonts w:ascii="Calibri" w:cs="Calibri" w:eastAsia="Calibri" w:hAnsi="Calibri"/>
+                <w:color w:val="111111"/>
+                <w:sz w:val="16"/>
+                <w:szCs w:val="16"/>
+              </w:rPr>
+              <w:t xml:space="preserve">Register with an email that already has an account.</w:t>
+            </w:r>
+          </w:p>
+        </w:tc>
+        <w:tc>
+          <w:tcPr>
+            <w:tcW w:type="dxa" w:w="1960"/>
+            <w:tcMar>
+              <w:top w:type="dxa" w:w="70"/>
+              <w:left w:type="dxa" w:w="110"/>
+              <w:bottom w:type="dxa" w:w="70"/>
+              <w:right w:type="dxa" w:w="110"/>
+            </w:tcMar>
+          </w:tcPr>
+          <w:p>
+            <w:pPr>
+              <w:spacing w:after="0" w:before="0" w:line="250"/>
+            </w:pPr>
+            <w:r>
+              <w:rPr>
+                <w:rFonts w:ascii="Calibri" w:cs="Calibri" w:eastAsia="Calibri" w:hAnsi="Calibri"/>
+                <w:color w:val="111111"/>
+                <w:sz w:val="16"/>
+                <w:szCs w:val="16"/>
+              </w:rPr>
+              <w:t xml:space="preserve">Refused, and told to sign in instead.</w:t>
+            </w:r>
+          </w:p>
+        </w:tc>
+        <w:tc>
+          <w:tcPr>
+            <w:tcW w:type="dxa" w:w="3116"/>
+            <w:tcMar>
+              <w:top w:type="dxa" w:w="70"/>
+              <w:left w:type="dxa" w:w="110"/>
+              <w:bottom w:type="dxa" w:w="70"/>
+              <w:right w:type="dxa" w:w="110"/>
+            </w:tcMar>
+          </w:tcPr>
+          <w:p>
+            <w:pPr>
+              <w:spacing w:after="0" w:before="0" w:line="250"/>
+            </w:pPr>
+            <w:r>
+              <w:rPr>
+                <w:rFonts w:ascii="Calibri" w:cs="Calibri" w:eastAsia="Calibri" w:hAnsi="Calibri"/>
+                <w:color w:val="111111"/>
+                <w:sz w:val="16"/>
+                <w:szCs w:val="16"/>
+              </w:rPr>
+              <w:t xml:space="preserve">HTTP 409 — “There is already an account with that email — try signing in”.</w:t>
+            </w:r>
+          </w:p>
+        </w:tc>
+        <w:tc>
+          <w:tcPr>
+            <w:tcW w:type="dxa" w:w="560"/>
+            <w:tcMar>
+              <w:top w:type="dxa" w:w="70"/>
+              <w:left w:type="dxa" w:w="110"/>
+              <w:bottom w:type="dxa" w:w="70"/>
+              <w:right w:type="dxa" w:w="110"/>
+            </w:tcMar>
+          </w:tcPr>
+          <w:p>
+            <w:pPr>
+              <w:spacing w:after="0" w:before="0" w:line="250"/>
+              <w:jc w:val="center"/>
+            </w:pPr>
+            <w:r>
+              <w:rPr>
+                <w:rFonts w:ascii="Calibri" w:cs="Calibri" w:eastAsia="Calibri" w:hAnsi="Calibri"/>
+                <w:b/>
+                <w:bCs/>
+                <w:color w:val="1E6B3A"/>
+                <w:sz w:val="15"/>
+                <w:szCs w:val="15"/>
+              </w:rPr>
+              <w:t xml:space="preserve">Pass</w:t>
+            </w:r>
+          </w:p>
+        </w:tc>
+        <w:tc>
+          <w:tcPr>
+            <w:tcW w:type="dxa" w:w="590"/>
+            <w:tcMar>
+              <w:top w:type="dxa" w:w="70"/>
+              <w:left w:type="dxa" w:w="110"/>
+              <w:bottom w:type="dxa" w:w="70"/>
+              <w:right w:type="dxa" w:w="110"/>
+            </w:tcMar>
+          </w:tcPr>
+          <w:p>
+            <w:pPr>
+              <w:spacing w:after="0" w:before="0" w:line="250"/>
+            </w:pPr>
+            <w:r>
+              <w:rPr>
+                <w:rFonts w:ascii="Calibri" w:cs="Calibri" w:eastAsia="Calibri" w:hAnsi="Calibri"/>
+                <w:color w:val="111111"/>
+                <w:sz w:val="17"/>
+                <w:szCs w:val="17"/>
+              </w:rPr>
+              <w:t xml:space="preserve"> </w:t>
+            </w:r>
+          </w:p>
+        </w:tc>
+      </w:tr>
+      <w:tr>
+        <w:tc>
+          <w:tcPr>
+            <w:tcW w:type="dxa" w:w="520"/>
+            <w:tcMar>
+              <w:top w:type="dxa" w:w="70"/>
+              <w:left w:type="dxa" w:w="110"/>
+              <w:bottom w:type="dxa" w:w="70"/>
+              <w:right w:type="dxa" w:w="110"/>
+            </w:tcMar>
+          </w:tcPr>
+          <w:p>
+            <w:pPr>
+              <w:spacing w:after="0" w:before="0" w:line="250"/>
+            </w:pPr>
+            <w:r>
+              <w:rPr>
+                <w:rFonts w:ascii="Calibri" w:cs="Calibri" w:eastAsia="Calibri" w:hAnsi="Calibri"/>
+                <w:b/>
+                <w:bCs/>
+                <w:color w:val="111111"/>
+                <w:sz w:val="16"/>
+                <w:szCs w:val="16"/>
+              </w:rPr>
+              <w:t xml:space="preserve">P4</w:t>
+            </w:r>
+          </w:p>
+        </w:tc>
+        <w:tc>
+          <w:tcPr>
+            <w:tcW w:type="dxa" w:w="2280"/>
+            <w:tcMar>
+              <w:top w:type="dxa" w:w="70"/>
+              <w:left w:type="dxa" w:w="110"/>
+              <w:bottom w:type="dxa" w:w="70"/>
+              <w:right w:type="dxa" w:w="110"/>
+            </w:tcMar>
+          </w:tcPr>
+          <w:p>
+            <w:pPr>
+              <w:spacing w:after="0" w:before="0" w:line="250"/>
+            </w:pPr>
+            <w:r>
+              <w:rPr>
+                <w:rFonts w:ascii="Calibri" w:cs="Calibri" w:eastAsia="Calibri" w:hAnsi="Calibri"/>
+                <w:color w:val="111111"/>
+                <w:sz w:val="16"/>
+                <w:szCs w:val="16"/>
+              </w:rPr>
+              <w:t xml:space="preserve">Register fully, then sign out and sign back in.</w:t>
+            </w:r>
+          </w:p>
+        </w:tc>
+        <w:tc>
+          <w:tcPr>
+            <w:tcW w:type="dxa" w:w="1960"/>
+            <w:tcMar>
+              <w:top w:type="dxa" w:w="70"/>
+              <w:left w:type="dxa" w:w="110"/>
+              <w:bottom w:type="dxa" w:w="70"/>
+              <w:right w:type="dxa" w:w="110"/>
+            </w:tcMar>
+          </w:tcPr>
+          <w:p>
+            <w:pPr>
+              <w:spacing w:after="0" w:before="0" w:line="250"/>
+            </w:pPr>
+            <w:r>
+              <w:rPr>
+                <w:rFonts w:ascii="Calibri" w:cs="Calibri" w:eastAsia="Calibri" w:hAnsi="Calibri"/>
+                <w:color w:val="111111"/>
+                <w:sz w:val="16"/>
+                <w:szCs w:val="16"/>
+              </w:rPr>
+              <w:t xml:space="preserve">Works both ways.</w:t>
+            </w:r>
+          </w:p>
+        </w:tc>
+        <w:tc>
+          <w:tcPr>
+            <w:tcW w:type="dxa" w:w="3116"/>
+            <w:tcMar>
+              <w:top w:type="dxa" w:w="70"/>
+              <w:left w:type="dxa" w:w="110"/>
+              <w:bottom w:type="dxa" w:w="70"/>
+              <w:right w:type="dxa" w:w="110"/>
+            </w:tcMar>
+          </w:tcPr>
+          <w:p>
+            <w:pPr>
+              <w:spacing w:after="0" w:before="0" w:line="250"/>
+            </w:pPr>
+            <w:r>
+              <w:rPr>
+                <w:rFonts w:ascii="Calibri" w:cs="Calibri" w:eastAsia="Calibri" w:hAnsi="Calibri"/>
+                <w:color w:val="111111"/>
+                <w:sz w:val="16"/>
+                <w:szCs w:val="16"/>
+              </w:rPr>
+              <w:t xml:space="preserve">Registration returns the client and signs them in; the same user ID and password sign in again.</w:t>
+            </w:r>
+          </w:p>
+        </w:tc>
+        <w:tc>
+          <w:tcPr>
+            <w:tcW w:type="dxa" w:w="560"/>
+            <w:tcMar>
+              <w:top w:type="dxa" w:w="70"/>
+              <w:left w:type="dxa" w:w="110"/>
+              <w:bottom w:type="dxa" w:w="70"/>
+              <w:right w:type="dxa" w:w="110"/>
+            </w:tcMar>
+          </w:tcPr>
+          <w:p>
+            <w:pPr>
+              <w:spacing w:after="0" w:before="0" w:line="250"/>
+              <w:jc w:val="center"/>
+            </w:pPr>
+            <w:r>
+              <w:rPr>
+                <w:rFonts w:ascii="Calibri" w:cs="Calibri" w:eastAsia="Calibri" w:hAnsi="Calibri"/>
+                <w:b/>
+                <w:bCs/>
+                <w:color w:val="1E6B3A"/>
+                <w:sz w:val="15"/>
+                <w:szCs w:val="15"/>
+              </w:rPr>
+              <w:t xml:space="preserve">Pass</w:t>
+            </w:r>
+          </w:p>
+        </w:tc>
+        <w:tc>
+          <w:tcPr>
+            <w:tcW w:type="dxa" w:w="590"/>
+            <w:tcMar>
+              <w:top w:type="dxa" w:w="70"/>
+              <w:left w:type="dxa" w:w="110"/>
+              <w:bottom w:type="dxa" w:w="70"/>
+              <w:right w:type="dxa" w:w="110"/>
+            </w:tcMar>
+          </w:tcPr>
+          <w:p>
+            <w:pPr>
+              <w:spacing w:after="0" w:before="0" w:line="250"/>
+            </w:pPr>
+            <w:r>
+              <w:rPr>
+                <w:rFonts w:ascii="Calibri" w:cs="Calibri" w:eastAsia="Calibri" w:hAnsi="Calibri"/>
+                <w:color w:val="111111"/>
+                <w:sz w:val="17"/>
+                <w:szCs w:val="17"/>
+              </w:rPr>
+              <w:t xml:space="preserve"> </w:t>
+            </w:r>
+          </w:p>
+        </w:tc>
+      </w:tr>
+      <w:tr>
+        <w:tc>
+          <w:tcPr>
+            <w:tcW w:type="dxa" w:w="520"/>
+            <w:tcMar>
+              <w:top w:type="dxa" w:w="70"/>
+              <w:left w:type="dxa" w:w="110"/>
+              <w:bottom w:type="dxa" w:w="70"/>
+              <w:right w:type="dxa" w:w="110"/>
+            </w:tcMar>
+          </w:tcPr>
+          <w:p>
+            <w:pPr>
+              <w:spacing w:after="0" w:before="0" w:line="250"/>
+            </w:pPr>
+            <w:r>
+              <w:rPr>
+                <w:rFonts w:ascii="Calibri" w:cs="Calibri" w:eastAsia="Calibri" w:hAnsi="Calibri"/>
+                <w:b/>
+                <w:bCs/>
+                <w:color w:val="111111"/>
+                <w:sz w:val="16"/>
+                <w:szCs w:val="16"/>
+              </w:rPr>
+              <w:t xml:space="preserve">P5</w:t>
+            </w:r>
+          </w:p>
+        </w:tc>
+        <w:tc>
+          <w:tcPr>
+            <w:tcW w:type="dxa" w:w="2280"/>
+            <w:tcMar>
+              <w:top w:type="dxa" w:w="70"/>
+              <w:left w:type="dxa" w:w="110"/>
+              <w:bottom w:type="dxa" w:w="70"/>
+              <w:right w:type="dxa" w:w="110"/>
+            </w:tcMar>
+          </w:tcPr>
+          <w:p>
+            <w:pPr>
+              <w:spacing w:after="0" w:before="0" w:line="250"/>
+            </w:pPr>
+            <w:r>
+              <w:rPr>
+                <w:rFonts w:ascii="Calibri" w:cs="Calibri" w:eastAsia="Calibri" w:hAnsi="Calibri"/>
+                <w:color w:val="111111"/>
+                <w:sz w:val="16"/>
+                <w:szCs w:val="16"/>
+              </w:rPr>
+              <w:t xml:space="preserve">Look for the Google button.</w:t>
+            </w:r>
+          </w:p>
+        </w:tc>
+        <w:tc>
+          <w:tcPr>
+            <w:tcW w:type="dxa" w:w="1960"/>
+            <w:tcMar>
+              <w:top w:type="dxa" w:w="70"/>
+              <w:left w:type="dxa" w:w="110"/>
+              <w:bottom w:type="dxa" w:w="70"/>
+              <w:right w:type="dxa" w:w="110"/>
+            </w:tcMar>
+          </w:tcPr>
+          <w:p>
+            <w:pPr>
+              <w:spacing w:after="0" w:before="0" w:line="250"/>
+            </w:pPr>
+            <w:r>
+              <w:rPr>
+                <w:rFonts w:ascii="Calibri" w:cs="Calibri" w:eastAsia="Calibri" w:hAnsi="Calibri"/>
+                <w:color w:val="111111"/>
+                <w:sz w:val="16"/>
+                <w:szCs w:val="16"/>
+              </w:rPr>
+              <w:t xml:space="preserve">Shown only when Google sign-in is switched on. Never a button that does nothing.</w:t>
+            </w:r>
+          </w:p>
+        </w:tc>
+        <w:tc>
+          <w:tcPr>
+            <w:tcW w:type="dxa" w:w="3116"/>
+            <w:tcMar>
+              <w:top w:type="dxa" w:w="70"/>
+              <w:left w:type="dxa" w:w="110"/>
+              <w:bottom w:type="dxa" w:w="70"/>
+              <w:right w:type="dxa" w:w="110"/>
+            </w:tcMar>
+          </w:tcPr>
+          <w:p>
+            <w:pPr>
+              <w:spacing w:after="0" w:before="0" w:line="250"/>
+            </w:pPr>
+            <w:r>
+              <w:rPr>
+                <w:rFonts w:ascii="Calibri" w:cs="Calibri" w:eastAsia="Calibri" w:hAnsi="Calibri"/>
+                <w:color w:val="111111"/>
+                <w:sz w:val="16"/>
+                <w:szCs w:val="16"/>
+              </w:rPr>
+              <w:t xml:space="preserve">With no credentials configured the button is not drawn at all and the API answers 503.</w:t>
+            </w:r>
+          </w:p>
+        </w:tc>
+        <w:tc>
+          <w:tcPr>
+            <w:tcW w:type="dxa" w:w="560"/>
+            <w:tcMar>
+              <w:top w:type="dxa" w:w="70"/>
+              <w:left w:type="dxa" w:w="110"/>
+              <w:bottom w:type="dxa" w:w="70"/>
+              <w:right w:type="dxa" w:w="110"/>
+            </w:tcMar>
+          </w:tcPr>
+          <w:p>
+            <w:pPr>
+              <w:spacing w:after="0" w:before="0" w:line="250"/>
+              <w:jc w:val="center"/>
+            </w:pPr>
+            <w:r>
+              <w:rPr>
+                <w:rFonts w:ascii="Calibri" w:cs="Calibri" w:eastAsia="Calibri" w:hAnsi="Calibri"/>
+                <w:b/>
+                <w:bCs/>
+                <w:color w:val="1E6B3A"/>
+                <w:sz w:val="15"/>
+                <w:szCs w:val="15"/>
+              </w:rPr>
+              <w:t xml:space="preserve">Pass</w:t>
+            </w:r>
+          </w:p>
+        </w:tc>
+        <w:tc>
+          <w:tcPr>
+            <w:tcW w:type="dxa" w:w="590"/>
+            <w:tcMar>
+              <w:top w:type="dxa" w:w="70"/>
+              <w:left w:type="dxa" w:w="110"/>
+              <w:bottom w:type="dxa" w:w="70"/>
+              <w:right w:type="dxa" w:w="110"/>
+            </w:tcMar>
+          </w:tcPr>
+          <w:p>
+            <w:pPr>
+              <w:spacing w:after="0" w:before="0" w:line="250"/>
+            </w:pPr>
+            <w:r>
+              <w:rPr>
+                <w:rFonts w:ascii="Calibri" w:cs="Calibri" w:eastAsia="Calibri" w:hAnsi="Calibri"/>
+                <w:color w:val="111111"/>
+                <w:sz w:val="17"/>
+                <w:szCs w:val="17"/>
+              </w:rPr>
+              <w:t xml:space="preserve"> </w:t>
+            </w:r>
+          </w:p>
+        </w:tc>
+      </w:tr>
+      <w:tr>
+        <w:tc>
+          <w:tcPr>
+            <w:tcW w:type="dxa" w:w="520"/>
+            <w:tcMar>
+              <w:top w:type="dxa" w:w="70"/>
+              <w:left w:type="dxa" w:w="110"/>
+              <w:bottom w:type="dxa" w:w="70"/>
+              <w:right w:type="dxa" w:w="110"/>
+            </w:tcMar>
+          </w:tcPr>
+          <w:p>
+            <w:pPr>
+              <w:spacing w:after="0" w:before="0" w:line="250"/>
+            </w:pPr>
+            <w:r>
+              <w:rPr>
+                <w:rFonts w:ascii="Calibri" w:cs="Calibri" w:eastAsia="Calibri" w:hAnsi="Calibri"/>
+                <w:b/>
+                <w:bCs/>
+                <w:color w:val="111111"/>
+                <w:sz w:val="16"/>
+                <w:szCs w:val="16"/>
+              </w:rPr>
+              <w:t xml:space="preserve">P6</w:t>
+            </w:r>
+          </w:p>
+        </w:tc>
+        <w:tc>
+          <w:tcPr>
+            <w:tcW w:type="dxa" w:w="2280"/>
+            <w:tcMar>
+              <w:top w:type="dxa" w:w="70"/>
+              <w:left w:type="dxa" w:w="110"/>
+              <w:bottom w:type="dxa" w:w="70"/>
+              <w:right w:type="dxa" w:w="110"/>
+            </w:tcMar>
+          </w:tcPr>
+          <w:p>
+            <w:pPr>
+              <w:spacing w:after="0" w:before="0" w:line="250"/>
+            </w:pPr>
+            <w:r>
+              <w:rPr>
+                <w:rFonts w:ascii="Calibri" w:cs="Calibri" w:eastAsia="Calibri" w:hAnsi="Calibri"/>
+                <w:color w:val="111111"/>
+                <w:sz w:val="16"/>
+                <w:szCs w:val="16"/>
+              </w:rPr>
+              <w:t xml:space="preserve">With Google switched on, press the button.</w:t>
+            </w:r>
+          </w:p>
+        </w:tc>
+        <w:tc>
+          <w:tcPr>
+            <w:tcW w:type="dxa" w:w="1960"/>
+            <w:tcMar>
+              <w:top w:type="dxa" w:w="70"/>
+              <w:left w:type="dxa" w:w="110"/>
+              <w:bottom w:type="dxa" w:w="70"/>
+              <w:right w:type="dxa" w:w="110"/>
+            </w:tcMar>
+          </w:tcPr>
+          <w:p>
+            <w:pPr>
+              <w:spacing w:after="0" w:before="0" w:line="250"/>
+            </w:pPr>
+            <w:r>
+              <w:rPr>
+                <w:rFonts w:ascii="Calibri" w:cs="Calibri" w:eastAsia="Calibri" w:hAnsi="Calibri"/>
+                <w:color w:val="111111"/>
+                <w:sz w:val="16"/>
+                <w:szCs w:val="16"/>
+              </w:rPr>
+              <w:t xml:space="preserve">Goes to Google’s account chooser.</w:t>
+            </w:r>
+          </w:p>
+        </w:tc>
+        <w:tc>
+          <w:tcPr>
+            <w:tcW w:type="dxa" w:w="3116"/>
+            <w:tcMar>
+              <w:top w:type="dxa" w:w="70"/>
+              <w:left w:type="dxa" w:w="110"/>
+              <w:bottom w:type="dxa" w:w="70"/>
+              <w:right w:type="dxa" w:w="110"/>
+            </w:tcMar>
+          </w:tcPr>
+          <w:p>
+            <w:pPr>
+              <w:spacing w:after="0" w:before="0" w:line="250"/>
+            </w:pPr>
+            <w:r>
+              <w:rPr>
+                <w:rFonts w:ascii="Calibri" w:cs="Calibri" w:eastAsia="Calibri" w:hAnsi="Calibri"/>
+                <w:color w:val="111111"/>
+                <w:sz w:val="16"/>
+                <w:szCs w:val="16"/>
+              </w:rPr>
+              <w:t xml:space="preserve">Redirects to accounts.google.com with a one-time state and a PKCE challenge.</w:t>
+            </w:r>
+          </w:p>
+        </w:tc>
+        <w:tc>
+          <w:tcPr>
+            <w:tcW w:type="dxa" w:w="560"/>
+            <w:tcMar>
+              <w:top w:type="dxa" w:w="70"/>
+              <w:left w:type="dxa" w:w="110"/>
+              <w:bottom w:type="dxa" w:w="70"/>
+              <w:right w:type="dxa" w:w="110"/>
+            </w:tcMar>
+          </w:tcPr>
+          <w:p>
+            <w:pPr>
+              <w:spacing w:after="0" w:before="0" w:line="250"/>
+              <w:jc w:val="center"/>
+            </w:pPr>
+            <w:r>
+              <w:rPr>
+                <w:rFonts w:ascii="Calibri" w:cs="Calibri" w:eastAsia="Calibri" w:hAnsi="Calibri"/>
+                <w:b/>
+                <w:bCs/>
+                <w:color w:val="1E6B3A"/>
+                <w:sz w:val="15"/>
+                <w:szCs w:val="15"/>
+              </w:rPr>
+              <w:t xml:space="preserve">Pass</w:t>
+            </w:r>
+          </w:p>
+        </w:tc>
+        <w:tc>
+          <w:tcPr>
+            <w:tcW w:type="dxa" w:w="590"/>
+            <w:tcMar>
+              <w:top w:type="dxa" w:w="70"/>
+              <w:left w:type="dxa" w:w="110"/>
+              <w:bottom w:type="dxa" w:w="70"/>
+              <w:right w:type="dxa" w:w="110"/>
+            </w:tcMar>
+          </w:tcPr>
+          <w:p>
+            <w:pPr>
+              <w:spacing w:after="0" w:before="0" w:line="250"/>
+            </w:pPr>
+            <w:r>
+              <w:rPr>
+                <w:rFonts w:ascii="Calibri" w:cs="Calibri" w:eastAsia="Calibri" w:hAnsi="Calibri"/>
+                <w:color w:val="111111"/>
+                <w:sz w:val="17"/>
+                <w:szCs w:val="17"/>
+              </w:rPr>
+              <w:t xml:space="preserve"> </w:t>
+            </w:r>
+          </w:p>
+        </w:tc>
+      </w:tr>
+      <w:tr>
+        <w:tc>
+          <w:tcPr>
+            <w:tcW w:type="dxa" w:w="520"/>
+            <w:tcMar>
+              <w:top w:type="dxa" w:w="70"/>
+              <w:left w:type="dxa" w:w="110"/>
+              <w:bottom w:type="dxa" w:w="70"/>
+              <w:right w:type="dxa" w:w="110"/>
+            </w:tcMar>
+          </w:tcPr>
+          <w:p>
+            <w:pPr>
+              <w:spacing w:after="0" w:before="0" w:line="250"/>
+            </w:pPr>
+            <w:r>
+              <w:rPr>
+                <w:rFonts w:ascii="Calibri" w:cs="Calibri" w:eastAsia="Calibri" w:hAnsi="Calibri"/>
+                <w:b/>
+                <w:bCs/>
+                <w:color w:val="111111"/>
+                <w:sz w:val="16"/>
+                <w:szCs w:val="16"/>
+              </w:rPr>
+              <w:t xml:space="preserve">P7</w:t>
+            </w:r>
+          </w:p>
+        </w:tc>
+        <w:tc>
+          <w:tcPr>
+            <w:tcW w:type="dxa" w:w="2280"/>
+            <w:tcMar>
+              <w:top w:type="dxa" w:w="70"/>
+              <w:left w:type="dxa" w:w="110"/>
+              <w:bottom w:type="dxa" w:w="70"/>
+              <w:right w:type="dxa" w:w="110"/>
+            </w:tcMar>
+          </w:tcPr>
+          <w:p>
+            <w:pPr>
+              <w:spacing w:after="0" w:before="0" w:line="250"/>
+            </w:pPr>
+            <w:r>
+              <w:rPr>
+                <w:rFonts w:ascii="Calibri" w:cs="Calibri" w:eastAsia="Calibri" w:hAnsi="Calibri"/>
+                <w:color w:val="111111"/>
+                <w:sz w:val="16"/>
+                <w:szCs w:val="16"/>
+              </w:rPr>
+              <w:t xml:space="preserve">Sign in with a Google account whose email already has a password account.</w:t>
+            </w:r>
+          </w:p>
+        </w:tc>
+        <w:tc>
+          <w:tcPr>
+            <w:tcW w:type="dxa" w:w="1960"/>
+            <w:tcMar>
+              <w:top w:type="dxa" w:w="70"/>
+              <w:left w:type="dxa" w:w="110"/>
+              <w:bottom w:type="dxa" w:w="70"/>
+              <w:right w:type="dxa" w:w="110"/>
+            </w:tcMar>
+          </w:tcPr>
+          <w:p>
+            <w:pPr>
+              <w:spacing w:after="0" w:before="0" w:line="250"/>
+            </w:pPr>
+            <w:r>
+              <w:rPr>
+                <w:rFonts w:ascii="Calibri" w:cs="Calibri" w:eastAsia="Calibri" w:hAnsi="Calibri"/>
+                <w:color w:val="111111"/>
+                <w:sz w:val="16"/>
+                <w:szCs w:val="16"/>
+              </w:rPr>
+              <w:t xml:space="preserve">Attaches to the existing account. No duplicate, no second loyalty balance.</w:t>
+            </w:r>
+          </w:p>
+        </w:tc>
+        <w:tc>
+          <w:tcPr>
+            <w:tcW w:type="dxa" w:w="3116"/>
+            <w:tcMar>
+              <w:top w:type="dxa" w:w="70"/>
+              <w:left w:type="dxa" w:w="110"/>
+              <w:bottom w:type="dxa" w:w="70"/>
+              <w:right w:type="dxa" w:w="110"/>
+            </w:tcMar>
+          </w:tcPr>
+          <w:p>
+            <w:pPr>
+              <w:spacing w:after="0" w:before="0" w:line="250"/>
+            </w:pPr>
+            <w:r>
+              <w:rPr>
+                <w:rFonts w:ascii="Calibri" w:cs="Calibri" w:eastAsia="Calibri" w:hAnsi="Calibri"/>
+                <w:color w:val="111111"/>
+                <w:sz w:val="16"/>
+                <w:szCs w:val="16"/>
+              </w:rPr>
+              <w:t xml:space="preserve">Verified against the database: the existing account is linked, not copied.</w:t>
+            </w:r>
+          </w:p>
+        </w:tc>
+        <w:tc>
+          <w:tcPr>
+            <w:tcW w:type="dxa" w:w="560"/>
+            <w:tcMar>
+              <w:top w:type="dxa" w:w="70"/>
+              <w:left w:type="dxa" w:w="110"/>
+              <w:bottom w:type="dxa" w:w="70"/>
+              <w:right w:type="dxa" w:w="110"/>
+            </w:tcMar>
+          </w:tcPr>
+          <w:p>
+            <w:pPr>
+              <w:spacing w:after="0" w:before="0" w:line="250"/>
+              <w:jc w:val="center"/>
+            </w:pPr>
+            <w:r>
+              <w:rPr>
+                <w:rFonts w:ascii="Calibri" w:cs="Calibri" w:eastAsia="Calibri" w:hAnsi="Calibri"/>
+                <w:b/>
+                <w:bCs/>
+                <w:color w:val="1E6B3A"/>
+                <w:sz w:val="15"/>
+                <w:szCs w:val="15"/>
+              </w:rPr>
+              <w:t xml:space="preserve">Pass</w:t>
+            </w:r>
+          </w:p>
+        </w:tc>
+        <w:tc>
+          <w:tcPr>
+            <w:tcW w:type="dxa" w:w="590"/>
+            <w:tcMar>
+              <w:top w:type="dxa" w:w="70"/>
+              <w:left w:type="dxa" w:w="110"/>
+              <w:bottom w:type="dxa" w:w="70"/>
+              <w:right w:type="dxa" w:w="110"/>
+            </w:tcMar>
+          </w:tcPr>
+          <w:p>
+            <w:pPr>
+              <w:spacing w:after="0" w:before="0" w:line="250"/>
+            </w:pPr>
+            <w:r>
+              <w:rPr>
+                <w:rFonts w:ascii="Calibri" w:cs="Calibri" w:eastAsia="Calibri" w:hAnsi="Calibri"/>
+                <w:color w:val="111111"/>
+                <w:sz w:val="17"/>
+                <w:szCs w:val="17"/>
+              </w:rPr>
+              <w:t xml:space="preserve"> </w:t>
+            </w:r>
+          </w:p>
+        </w:tc>
+      </w:tr>
+      <w:tr>
+        <w:tc>
+          <w:tcPr>
+            <w:tcW w:type="dxa" w:w="520"/>
+            <w:tcMar>
+              <w:top w:type="dxa" w:w="70"/>
+              <w:left w:type="dxa" w:w="110"/>
+              <w:bottom w:type="dxa" w:w="70"/>
+              <w:right w:type="dxa" w:w="110"/>
+            </w:tcMar>
+          </w:tcPr>
+          <w:p>
+            <w:pPr>
+              <w:spacing w:after="0" w:before="0" w:line="250"/>
+            </w:pPr>
+            <w:r>
+              <w:rPr>
+                <w:rFonts w:ascii="Calibri" w:cs="Calibri" w:eastAsia="Calibri" w:hAnsi="Calibri"/>
+                <w:b/>
+                <w:bCs/>
+                <w:color w:val="111111"/>
+                <w:sz w:val="16"/>
+                <w:szCs w:val="16"/>
+              </w:rPr>
+              <w:t xml:space="preserve">P8</w:t>
+            </w:r>
+          </w:p>
+        </w:tc>
+        <w:tc>
+          <w:tcPr>
+            <w:tcW w:type="dxa" w:w="2280"/>
+            <w:tcMar>
+              <w:top w:type="dxa" w:w="70"/>
+              <w:left w:type="dxa" w:w="110"/>
+              <w:bottom w:type="dxa" w:w="70"/>
+              <w:right w:type="dxa" w:w="110"/>
+            </w:tcMar>
+          </w:tcPr>
+          <w:p>
+            <w:pPr>
+              <w:spacing w:after="0" w:before="0" w:line="250"/>
+            </w:pPr>
+            <w:r>
+              <w:rPr>
+                <w:rFonts w:ascii="Calibri" w:cs="Calibri" w:eastAsia="Calibri" w:hAnsi="Calibri"/>
+                <w:color w:val="111111"/>
+                <w:sz w:val="16"/>
+                <w:szCs w:val="16"/>
+              </w:rPr>
+              <w:t xml:space="preserve">Sign in with a brand new Google account.</w:t>
+            </w:r>
+          </w:p>
+        </w:tc>
+        <w:tc>
+          <w:tcPr>
+            <w:tcW w:type="dxa" w:w="1960"/>
+            <w:tcMar>
+              <w:top w:type="dxa" w:w="70"/>
+              <w:left w:type="dxa" w:w="110"/>
+              <w:bottom w:type="dxa" w:w="70"/>
+              <w:right w:type="dxa" w:w="110"/>
+            </w:tcMar>
+          </w:tcPr>
+          <w:p>
+            <w:pPr>
+              <w:spacing w:after="0" w:before="0" w:line="250"/>
+            </w:pPr>
+            <w:r>
+              <w:rPr>
+                <w:rFonts w:ascii="Calibri" w:cs="Calibri" w:eastAsia="Calibri" w:hAnsi="Calibri"/>
+                <w:color w:val="111111"/>
+                <w:sz w:val="16"/>
+                <w:szCs w:val="16"/>
+              </w:rPr>
+              <w:t xml:space="preserve">An account is created and they are signed straight in.</w:t>
+            </w:r>
+          </w:p>
+        </w:tc>
+        <w:tc>
+          <w:tcPr>
+            <w:tcW w:type="dxa" w:w="3116"/>
+            <w:tcMar>
+              <w:top w:type="dxa" w:w="70"/>
+              <w:left w:type="dxa" w:w="110"/>
+              <w:bottom w:type="dxa" w:w="70"/>
+              <w:right w:type="dxa" w:w="110"/>
+            </w:tcMar>
+          </w:tcPr>
+          <w:p>
+            <w:pPr>
+              <w:spacing w:after="0" w:before="0" w:line="250"/>
+            </w:pPr>
+            <w:r>
+              <w:rPr>
+                <w:rFonts w:ascii="Calibri" w:cs="Calibri" w:eastAsia="Calibri" w:hAnsi="Calibri"/>
+                <w:color w:val="111111"/>
+                <w:sz w:val="16"/>
+                <w:szCs w:val="16"/>
+              </w:rPr>
+              <w:t xml:space="preserve">A user ID is generated from the email so nothing is asked of them.</w:t>
+            </w:r>
+          </w:p>
+        </w:tc>
+        <w:tc>
+          <w:tcPr>
+            <w:tcW w:type="dxa" w:w="560"/>
+            <w:tcMar>
+              <w:top w:type="dxa" w:w="70"/>
+              <w:left w:type="dxa" w:w="110"/>
+              <w:bottom w:type="dxa" w:w="70"/>
+              <w:right w:type="dxa" w:w="110"/>
+            </w:tcMar>
+          </w:tcPr>
+          <w:p>
+            <w:pPr>
+              <w:spacing w:after="0" w:before="0" w:line="250"/>
+              <w:jc w:val="center"/>
+            </w:pPr>
+            <w:r>
+              <w:rPr>
+                <w:rFonts w:ascii="Calibri" w:cs="Calibri" w:eastAsia="Calibri" w:hAnsi="Calibri"/>
+                <w:b/>
+                <w:bCs/>
+                <w:color w:val="1E6B3A"/>
+                <w:sz w:val="15"/>
+                <w:szCs w:val="15"/>
+              </w:rPr>
+              <w:t xml:space="preserve">Pass</w:t>
+            </w:r>
+          </w:p>
+        </w:tc>
+        <w:tc>
+          <w:tcPr>
+            <w:tcW w:type="dxa" w:w="590"/>
+            <w:tcMar>
+              <w:top w:type="dxa" w:w="70"/>
+              <w:left w:type="dxa" w:w="110"/>
+              <w:bottom w:type="dxa" w:w="70"/>
+              <w:right w:type="dxa" w:w="110"/>
+            </w:tcMar>
+          </w:tcPr>
+          <w:p>
+            <w:pPr>
+              <w:spacing w:after="0" w:before="0" w:line="250"/>
+            </w:pPr>
+            <w:r>
+              <w:rPr>
+                <w:rFonts w:ascii="Calibri" w:cs="Calibri" w:eastAsia="Calibri" w:hAnsi="Calibri"/>
+                <w:color w:val="111111"/>
+                <w:sz w:val="17"/>
+                <w:szCs w:val="17"/>
+              </w:rPr>
+              <w:t xml:space="preserve"> </w:t>
+            </w:r>
+          </w:p>
+        </w:tc>
+      </w:tr>
+      <w:tr>
+        <w:tc>
+          <w:tcPr>
+            <w:tcW w:type="dxa" w:w="520"/>
+            <w:tcMar>
+              <w:top w:type="dxa" w:w="70"/>
+              <w:left w:type="dxa" w:w="110"/>
+              <w:bottom w:type="dxa" w:w="70"/>
+              <w:right w:type="dxa" w:w="110"/>
+            </w:tcMar>
+          </w:tcPr>
+          <w:p>
+            <w:pPr>
+              <w:spacing w:after="0" w:before="0" w:line="250"/>
+            </w:pPr>
+            <w:r>
+              <w:rPr>
+                <w:rFonts w:ascii="Calibri" w:cs="Calibri" w:eastAsia="Calibri" w:hAnsi="Calibri"/>
+                <w:b/>
+                <w:bCs/>
+                <w:color w:val="111111"/>
+                <w:sz w:val="16"/>
+                <w:szCs w:val="16"/>
+              </w:rPr>
+              <w:t xml:space="preserve">P9</w:t>
+            </w:r>
+          </w:p>
+        </w:tc>
+        <w:tc>
+          <w:tcPr>
+            <w:tcW w:type="dxa" w:w="2280"/>
+            <w:tcMar>
+              <w:top w:type="dxa" w:w="70"/>
+              <w:left w:type="dxa" w:w="110"/>
+              <w:bottom w:type="dxa" w:w="70"/>
+              <w:right w:type="dxa" w:w="110"/>
+            </w:tcMar>
+          </w:tcPr>
+          <w:p>
+            <w:pPr>
+              <w:spacing w:after="0" w:before="0" w:line="250"/>
+            </w:pPr>
+            <w:r>
+              <w:rPr>
+                <w:rFonts w:ascii="Calibri" w:cs="Calibri" w:eastAsia="Calibri" w:hAnsi="Calibri"/>
+                <w:color w:val="111111"/>
+                <w:sz w:val="16"/>
+                <w:szCs w:val="16"/>
+              </w:rPr>
+              <w:t xml:space="preserve">Complete a Google sign-in end to end on the live site.</w:t>
+            </w:r>
+          </w:p>
+        </w:tc>
+        <w:tc>
+          <w:tcPr>
+            <w:tcW w:type="dxa" w:w="1960"/>
+            <w:tcMar>
+              <w:top w:type="dxa" w:w="70"/>
+              <w:left w:type="dxa" w:w="110"/>
+              <w:bottom w:type="dxa" w:w="70"/>
+              <w:right w:type="dxa" w:w="110"/>
+            </w:tcMar>
+          </w:tcPr>
+          <w:p>
+            <w:pPr>
+              <w:spacing w:after="0" w:before="0" w:line="250"/>
+            </w:pPr>
+            <w:r>
+              <w:rPr>
+                <w:rFonts w:ascii="Calibri" w:cs="Calibri" w:eastAsia="Calibri" w:hAnsi="Calibri"/>
+                <w:color w:val="111111"/>
+                <w:sz w:val="16"/>
+                <w:szCs w:val="16"/>
+              </w:rPr>
+              <w:t xml:space="preserve">Signed in and returned to where you started.</w:t>
+            </w:r>
+          </w:p>
+        </w:tc>
+        <w:tc>
+          <w:tcPr>
+            <w:tcW w:type="dxa" w:w="3116"/>
+            <w:tcMar>
+              <w:top w:type="dxa" w:w="70"/>
+              <w:left w:type="dxa" w:w="110"/>
+              <w:bottom w:type="dxa" w:w="70"/>
+              <w:right w:type="dxa" w:w="110"/>
+            </w:tcMar>
+          </w:tcPr>
+          <w:p>
+            <w:pPr>
+              <w:spacing w:after="0" w:before="0" w:line="250"/>
+            </w:pPr>
+            <w:r>
+              <w:rPr>
+                <w:rFonts w:ascii="Calibri" w:cs="Calibri" w:eastAsia="Calibri" w:hAnsi="Calibri"/>
+                <w:color w:val="8A5A00"/>
+                <w:sz w:val="16"/>
+                <w:szCs w:val="16"/>
+              </w:rPr>
+              <w:t xml:space="preserve">NOT TESTED — this needs live Google credentials, which were added after this run. Please complete it and record the result here.</w:t>
+            </w:r>
+          </w:p>
+        </w:tc>
+        <w:tc>
+          <w:tcPr>
+            <w:tcW w:type="dxa" w:w="560"/>
+            <w:tcMar>
+              <w:top w:type="dxa" w:w="70"/>
+              <w:left w:type="dxa" w:w="110"/>
+              <w:bottom w:type="dxa" w:w="70"/>
+              <w:right w:type="dxa" w:w="110"/>
+            </w:tcMar>
+          </w:tcPr>
+          <w:p>
+            <w:pPr>
+              <w:spacing w:after="0" w:before="0" w:line="250"/>
+              <w:jc w:val="center"/>
+            </w:pPr>
+            <w:r>
+              <w:rPr>
+                <w:rFonts w:ascii="Calibri" w:cs="Calibri" w:eastAsia="Calibri" w:hAnsi="Calibri"/>
+                <w:b/>
+                <w:bCs/>
+                <w:color w:val="8A5A00"/>
+                <w:sz w:val="15"/>
+                <w:szCs w:val="15"/>
+              </w:rPr>
+              <w:t xml:space="preserve">Note</w:t>
+            </w:r>
+          </w:p>
+        </w:tc>
+        <w:tc>
+          <w:tcPr>
+            <w:tcW w:type="dxa" w:w="590"/>
+            <w:tcMar>
+              <w:top w:type="dxa" w:w="70"/>
+              <w:left w:type="dxa" w:w="110"/>
+              <w:bottom w:type="dxa" w:w="70"/>
+              <w:right w:type="dxa" w:w="110"/>
+            </w:tcMar>
+          </w:tcPr>
+          <w:p>
+            <w:pPr>
+              <w:spacing w:after="0" w:before="0" w:line="250"/>
+            </w:pPr>
+            <w:r>
+              <w:rPr>
+                <w:rFonts w:ascii="Calibri" w:cs="Calibri" w:eastAsia="Calibri" w:hAnsi="Calibri"/>
+                <w:color w:val="111111"/>
+                <w:sz w:val="17"/>
+                <w:szCs w:val="17"/>
+              </w:rPr>
+              <w:t xml:space="preserve"> </w:t>
+            </w:r>
+          </w:p>
+        </w:tc>
+      </w:tr>
+      <w:tr>
+        <w:tc>
+          <w:tcPr>
+            <w:tcW w:type="dxa" w:w="520"/>
+            <w:tcMar>
+              <w:top w:type="dxa" w:w="70"/>
+              <w:left w:type="dxa" w:w="110"/>
+              <w:bottom w:type="dxa" w:w="70"/>
+              <w:right w:type="dxa" w:w="110"/>
+            </w:tcMar>
+          </w:tcPr>
+          <w:p>
+            <w:pPr>
+              <w:spacing w:after="0" w:before="0" w:line="250"/>
+            </w:pPr>
+            <w:r>
+              <w:rPr>
+                <w:rFonts w:ascii="Calibri" w:cs="Calibri" w:eastAsia="Calibri" w:hAnsi="Calibri"/>
+                <w:b/>
+                <w:bCs/>
+                <w:color w:val="111111"/>
+                <w:sz w:val="16"/>
+                <w:szCs w:val="16"/>
+              </w:rPr>
+              <w:t xml:space="preserve">P10</w:t>
+            </w:r>
+          </w:p>
+        </w:tc>
+        <w:tc>
+          <w:tcPr>
+            <w:tcW w:type="dxa" w:w="2280"/>
+            <w:tcMar>
+              <w:top w:type="dxa" w:w="70"/>
+              <w:left w:type="dxa" w:w="110"/>
+              <w:bottom w:type="dxa" w:w="70"/>
+              <w:right w:type="dxa" w:w="110"/>
+            </w:tcMar>
+          </w:tcPr>
+          <w:p>
+            <w:pPr>
+              <w:spacing w:after="0" w:before="0" w:line="250"/>
+            </w:pPr>
+            <w:r>
+              <w:rPr>
+                <w:rFonts w:ascii="Calibri" w:cs="Calibri" w:eastAsia="Calibri" w:hAnsi="Calibri"/>
+                <w:color w:val="111111"/>
+                <w:sz w:val="16"/>
+                <w:szCs w:val="16"/>
+              </w:rPr>
+              <w:t xml:space="preserve">Cancel at Google’s screen.</w:t>
+            </w:r>
+          </w:p>
+        </w:tc>
+        <w:tc>
+          <w:tcPr>
+            <w:tcW w:type="dxa" w:w="1960"/>
+            <w:tcMar>
+              <w:top w:type="dxa" w:w="70"/>
+              <w:left w:type="dxa" w:w="110"/>
+              <w:bottom w:type="dxa" w:w="70"/>
+              <w:right w:type="dxa" w:w="110"/>
+            </w:tcMar>
+          </w:tcPr>
+          <w:p>
+            <w:pPr>
+              <w:spacing w:after="0" w:before="0" w:line="250"/>
+            </w:pPr>
+            <w:r>
+              <w:rPr>
+                <w:rFonts w:ascii="Calibri" w:cs="Calibri" w:eastAsia="Calibri" w:hAnsi="Calibri"/>
+                <w:color w:val="111111"/>
+                <w:sz w:val="16"/>
+                <w:szCs w:val="16"/>
+              </w:rPr>
+              <w:t xml:space="preserve">Returned to the login page with a plain message, not an error page.</w:t>
+            </w:r>
+          </w:p>
+        </w:tc>
+        <w:tc>
+          <w:tcPr>
+            <w:tcW w:type="dxa" w:w="3116"/>
+            <w:tcMar>
+              <w:top w:type="dxa" w:w="70"/>
+              <w:left w:type="dxa" w:w="110"/>
+              <w:bottom w:type="dxa" w:w="70"/>
+              <w:right w:type="dxa" w:w="110"/>
+            </w:tcMar>
+          </w:tcPr>
+          <w:p>
+            <w:pPr>
+              <w:spacing w:after="0" w:before="0" w:line="250"/>
+            </w:pPr>
+            <w:r>
+              <w:rPr>
+                <w:rFonts w:ascii="Calibri" w:cs="Calibri" w:eastAsia="Calibri" w:hAnsi="Calibri"/>
+                <w:color w:val="111111"/>
+                <w:sz w:val="16"/>
+                <w:szCs w:val="16"/>
+              </w:rPr>
+              <w:t xml:space="preserve">“Google sign-in was cancelled.”</w:t>
+            </w:r>
+          </w:p>
+        </w:tc>
+        <w:tc>
+          <w:tcPr>
+            <w:tcW w:type="dxa" w:w="560"/>
+            <w:tcMar>
+              <w:top w:type="dxa" w:w="70"/>
+              <w:left w:type="dxa" w:w="110"/>
+              <w:bottom w:type="dxa" w:w="70"/>
+              <w:right w:type="dxa" w:w="110"/>
+            </w:tcMar>
+          </w:tcPr>
+          <w:p>
+            <w:pPr>
+              <w:spacing w:after="0" w:before="0" w:line="250"/>
+              <w:jc w:val="center"/>
+            </w:pPr>
+            <w:r>
+              <w:rPr>
+                <w:rFonts w:ascii="Calibri" w:cs="Calibri" w:eastAsia="Calibri" w:hAnsi="Calibri"/>
+                <w:b/>
+                <w:bCs/>
+                <w:color w:val="1E6B3A"/>
+                <w:sz w:val="15"/>
+                <w:szCs w:val="15"/>
+              </w:rPr>
+              <w:t xml:space="preserve">Pass</w:t>
+            </w:r>
+          </w:p>
+        </w:tc>
+        <w:tc>
+          <w:tcPr>
+            <w:tcW w:type="dxa" w:w="590"/>
+            <w:tcMar>
+              <w:top w:type="dxa" w:w="70"/>
+              <w:left w:type="dxa" w:w="110"/>
+              <w:bottom w:type="dxa" w:w="70"/>
+              <w:right w:type="dxa" w:w="110"/>
+            </w:tcMar>
+          </w:tcPr>
+          <w:p>
+            <w:pPr>
+              <w:spacing w:after="0" w:before="0" w:line="250"/>
+            </w:pPr>
+            <w:r>
+              <w:rPr>
+                <w:rFonts w:ascii="Calibri" w:cs="Calibri" w:eastAsia="Calibri" w:hAnsi="Calibri"/>
+                <w:color w:val="111111"/>
+                <w:sz w:val="17"/>
+                <w:szCs w:val="17"/>
+              </w:rPr>
+              <w:t xml:space="preserve"> </w:t>
+            </w:r>
+          </w:p>
+        </w:tc>
+      </w:tr>
+      <w:tr>
+        <w:tc>
+          <w:tcPr>
+            <w:tcW w:type="dxa" w:w="520"/>
+            <w:tcMar>
+              <w:top w:type="dxa" w:w="70"/>
+              <w:left w:type="dxa" w:w="110"/>
+              <w:bottom w:type="dxa" w:w="70"/>
+              <w:right w:type="dxa" w:w="110"/>
+            </w:tcMar>
+          </w:tcPr>
+          <w:p>
+            <w:pPr>
+              <w:spacing w:after="0" w:before="0" w:line="250"/>
+            </w:pPr>
+            <w:r>
+              <w:rPr>
+                <w:rFonts w:ascii="Calibri" w:cs="Calibri" w:eastAsia="Calibri" w:hAnsi="Calibri"/>
+                <w:b/>
+                <w:bCs/>
+                <w:color w:val="111111"/>
+                <w:sz w:val="16"/>
+                <w:szCs w:val="16"/>
+              </w:rPr>
+              <w:t xml:space="preserve">P11</w:t>
+            </w:r>
+          </w:p>
+        </w:tc>
+        <w:tc>
+          <w:tcPr>
+            <w:tcW w:type="dxa" w:w="2280"/>
+            <w:tcMar>
+              <w:top w:type="dxa" w:w="70"/>
+              <w:left w:type="dxa" w:w="110"/>
+              <w:bottom w:type="dxa" w:w="70"/>
+              <w:right w:type="dxa" w:w="110"/>
+            </w:tcMar>
+          </w:tcPr>
+          <w:p>
+            <w:pPr>
+              <w:spacing w:after="0" w:before="0" w:line="250"/>
+            </w:pPr>
+            <w:r>
+              <w:rPr>
+                <w:rFonts w:ascii="Calibri" w:cs="Calibri" w:eastAsia="Calibri" w:hAnsi="Calibri"/>
+                <w:color w:val="111111"/>
+                <w:sz w:val="16"/>
+                <w:szCs w:val="16"/>
+              </w:rPr>
+              <w:t xml:space="preserve">Tamper with the callback: change the one-time value in the address bar.</w:t>
+            </w:r>
+          </w:p>
+        </w:tc>
+        <w:tc>
+          <w:tcPr>
+            <w:tcW w:type="dxa" w:w="1960"/>
+            <w:tcMar>
+              <w:top w:type="dxa" w:w="70"/>
+              <w:left w:type="dxa" w:w="110"/>
+              <w:bottom w:type="dxa" w:w="70"/>
+              <w:right w:type="dxa" w:w="110"/>
+            </w:tcMar>
+          </w:tcPr>
+          <w:p>
+            <w:pPr>
+              <w:spacing w:after="0" w:before="0" w:line="250"/>
+            </w:pPr>
+            <w:r>
+              <w:rPr>
+                <w:rFonts w:ascii="Calibri" w:cs="Calibri" w:eastAsia="Calibri" w:hAnsi="Calibri"/>
+                <w:color w:val="111111"/>
+                <w:sz w:val="16"/>
+                <w:szCs w:val="16"/>
+              </w:rPr>
+              <w:t xml:space="preserve">Refused.</w:t>
+            </w:r>
+          </w:p>
+        </w:tc>
+        <w:tc>
+          <w:tcPr>
+            <w:tcW w:type="dxa" w:w="3116"/>
+            <w:tcMar>
+              <w:top w:type="dxa" w:w="70"/>
+              <w:left w:type="dxa" w:w="110"/>
+              <w:bottom w:type="dxa" w:w="70"/>
+              <w:right w:type="dxa" w:w="110"/>
+            </w:tcMar>
+          </w:tcPr>
+          <w:p>
+            <w:pPr>
+              <w:spacing w:after="0" w:before="0" w:line="250"/>
+            </w:pPr>
+            <w:r>
+              <w:rPr>
+                <w:rFonts w:ascii="Calibri" w:cs="Calibri" w:eastAsia="Calibri" w:hAnsi="Calibri"/>
+                <w:color w:val="111111"/>
+                <w:sz w:val="16"/>
+                <w:szCs w:val="16"/>
+              </w:rPr>
+              <w:t xml:space="preserve">Rejected — the sign-in cannot be verified. This is what stops someone logging you into their account.</w:t>
+            </w:r>
+          </w:p>
+        </w:tc>
+        <w:tc>
+          <w:tcPr>
+            <w:tcW w:type="dxa" w:w="560"/>
+            <w:tcMar>
+              <w:top w:type="dxa" w:w="70"/>
+              <w:left w:type="dxa" w:w="110"/>
+              <w:bottom w:type="dxa" w:w="70"/>
+              <w:right w:type="dxa" w:w="110"/>
+            </w:tcMar>
+          </w:tcPr>
+          <w:p>
+            <w:pPr>
+              <w:spacing w:after="0" w:before="0" w:line="250"/>
+              <w:jc w:val="center"/>
+            </w:pPr>
+            <w:r>
+              <w:rPr>
+                <w:rFonts w:ascii="Calibri" w:cs="Calibri" w:eastAsia="Calibri" w:hAnsi="Calibri"/>
+                <w:b/>
+                <w:bCs/>
+                <w:color w:val="1E6B3A"/>
+                <w:sz w:val="15"/>
+                <w:szCs w:val="15"/>
+              </w:rPr>
+              <w:t xml:space="preserve">Pass</w:t>
+            </w:r>
+          </w:p>
+        </w:tc>
+        <w:tc>
+          <w:tcPr>
+            <w:tcW w:type="dxa" w:w="590"/>
+            <w:tcMar>
+              <w:top w:type="dxa" w:w="70"/>
+              <w:left w:type="dxa" w:w="110"/>
+              <w:bottom w:type="dxa" w:w="70"/>
+              <w:right w:type="dxa" w:w="110"/>
+            </w:tcMar>
+          </w:tcPr>
+          <w:p>
+            <w:pPr>
+              <w:spacing w:after="0" w:before="0" w:line="250"/>
+            </w:pPr>
+            <w:r>
+              <w:rPr>
+                <w:rFonts w:ascii="Calibri" w:cs="Calibri" w:eastAsia="Calibri" w:hAnsi="Calibri"/>
+                <w:color w:val="111111"/>
+                <w:sz w:val="17"/>
+                <w:szCs w:val="17"/>
+              </w:rPr>
+              <w:t xml:space="preserve"> </w:t>
+            </w:r>
+          </w:p>
+        </w:tc>
+      </w:tr>
+    </w:tbl>
+    <w:p>
+      <w:pPr>
+        <w:spacing w:after="160"/>
+      </w:pPr>
+    </w:p>
+    <w:p>
+      <w:pPr>
+        <w:pStyle w:val="Heading2"/>
+        <w:spacing w:after="120" w:before="280"/>
+      </w:pPr>
+      <w:r>
+        <w:rPr>
+          <w:rFonts w:ascii="Calibri" w:cs="Calibri" w:eastAsia="Calibri" w:hAnsi="Calibri"/>
+          <w:b/>
+          <w:bCs/>
+          <w:color w:val="8A6D1F"/>
+          <w:sz w:val="24"/>
+          <w:szCs w:val="24"/>
+        </w:rPr>
+        <w:t xml:space="preserve">Q · The diary beyond today</w:t>
+      </w:r>
+    </w:p>
+    <w:p>
+      <w:pPr>
+        <w:spacing w:after="140" w:before="0" w:line="260"/>
+      </w:pPr>
+      <w:r>
+        <w:rPr>
+          <w:rFonts w:ascii="Calibri" w:cs="Calibri" w:eastAsia="Calibri" w:hAnsi="Calibri"/>
+          <w:color w:val="6B6B6B"/>
+          <w:sz w:val="18"/>
+          <w:szCs w:val="18"/>
+        </w:rPr>
+        <w:t xml:space="preserve">The salon’s history lives in the database. These tests are about reaching it from the screen.</w:t>
+      </w:r>
+    </w:p>
+    <w:tbl>
+      <w:tblPr>
+        <w:tblW w:type="dxa" w:w="9026"/>
+        <w:tblBorders>
+          <w:top w:val="single" w:color="D8D4C8" w:sz="2"/>
+          <w:left w:val="none"/>
+          <w:bottom w:val="single" w:color="D8D4C8" w:sz="2"/>
+          <w:right w:val="none"/>
+          <w:insideH w:val="single" w:color="D8D4C8" w:sz="2"/>
+          <w:insideV w:val="none"/>
+        </w:tblBorders>
+      </w:tblPr>
+      <w:tblGrid>
+        <w:gridCol w:w="520"/>
+        <w:gridCol w:w="2280"/>
+        <w:gridCol w:w="1960"/>
+        <w:gridCol w:w="3116"/>
+        <w:gridCol w:w="560"/>
+        <w:gridCol w:w="590"/>
+      </w:tblGrid>
+      <w:tr>
+        <w:trPr>
+          <w:tblHeader/>
+        </w:trPr>
+        <w:tc>
+          <w:tcPr>
+            <w:tcW w:type="dxa" w:w="520"/>
+            <w:shd w:fill="111111" w:color="auto" w:val="clear"/>
+            <w:tcMar>
+              <w:top w:type="dxa" w:w="70"/>
+              <w:left w:type="dxa" w:w="110"/>
+              <w:bottom w:type="dxa" w:w="70"/>
+              <w:right w:type="dxa" w:w="110"/>
+            </w:tcMar>
+          </w:tcPr>
+          <w:p>
+            <w:pPr>
+              <w:spacing w:after="0" w:before="0" w:line="250"/>
+            </w:pPr>
+            <w:r>
+              <w:rPr>
+                <w:rFonts w:ascii="Calibri" w:cs="Calibri" w:eastAsia="Calibri" w:hAnsi="Calibri"/>
+                <w:b/>
+                <w:bCs/>
+                <w:color w:val="FFFFFF"/>
+                <w:sz w:val="16"/>
+                <w:szCs w:val="16"/>
+              </w:rPr>
+              <w:t xml:space="preserve">#</w:t>
+            </w:r>
+          </w:p>
+        </w:tc>
+        <w:tc>
+          <w:tcPr>
+            <w:tcW w:type="dxa" w:w="2280"/>
+            <w:shd w:fill="111111" w:color="auto" w:val="clear"/>
+            <w:tcMar>
+              <w:top w:type="dxa" w:w="70"/>
+              <w:left w:type="dxa" w:w="110"/>
+              <w:bottom w:type="dxa" w:w="70"/>
+              <w:right w:type="dxa" w:w="110"/>
+            </w:tcMar>
+          </w:tcPr>
+          <w:p>
+            <w:pPr>
+              <w:spacing w:after="0" w:before="0" w:line="250"/>
+            </w:pPr>
+            <w:r>
+              <w:rPr>
+                <w:rFonts w:ascii="Calibri" w:cs="Calibri" w:eastAsia="Calibri" w:hAnsi="Calibri"/>
+                <w:b/>
+                <w:bCs/>
+                <w:color w:val="FFFFFF"/>
+                <w:sz w:val="16"/>
+                <w:szCs w:val="16"/>
+              </w:rPr>
+              <w:t xml:space="preserve">What to do</w:t>
+            </w:r>
+          </w:p>
+        </w:tc>
+        <w:tc>
+          <w:tcPr>
+            <w:tcW w:type="dxa" w:w="1960"/>
+            <w:shd w:fill="111111" w:color="auto" w:val="clear"/>
+            <w:tcMar>
+              <w:top w:type="dxa" w:w="70"/>
+              <w:left w:type="dxa" w:w="110"/>
+              <w:bottom w:type="dxa" w:w="70"/>
+              <w:right w:type="dxa" w:w="110"/>
+            </w:tcMar>
+          </w:tcPr>
+          <w:p>
+            <w:pPr>
+              <w:spacing w:after="0" w:before="0" w:line="250"/>
+            </w:pPr>
+            <w:r>
+              <w:rPr>
+                <w:rFonts w:ascii="Calibri" w:cs="Calibri" w:eastAsia="Calibri" w:hAnsi="Calibri"/>
+                <w:b/>
+                <w:bCs/>
+                <w:color w:val="FFFFFF"/>
+                <w:sz w:val="16"/>
+                <w:szCs w:val="16"/>
+              </w:rPr>
+              <w:t xml:space="preserve">What should happen</w:t>
+            </w:r>
+          </w:p>
+        </w:tc>
+        <w:tc>
+          <w:tcPr>
+            <w:tcW w:type="dxa" w:w="3116"/>
+            <w:shd w:fill="111111" w:color="auto" w:val="clear"/>
+            <w:tcMar>
+              <w:top w:type="dxa" w:w="70"/>
+              <w:left w:type="dxa" w:w="110"/>
+              <w:bottom w:type="dxa" w:w="70"/>
+              <w:right w:type="dxa" w:w="110"/>
+            </w:tcMar>
+          </w:tcPr>
+          <w:p>
+            <w:pPr>
+              <w:spacing w:after="0" w:before="0" w:line="250"/>
+            </w:pPr>
+            <w:r>
+              <w:rPr>
+                <w:rFonts w:ascii="Calibri" w:cs="Calibri" w:eastAsia="Calibri" w:hAnsi="Calibri"/>
+                <w:b/>
+                <w:bCs/>
+                <w:color w:val="FFFFFF"/>
+                <w:sz w:val="16"/>
+                <w:szCs w:val="16"/>
+              </w:rPr>
+              <w:t xml:space="preserve">What happened on 18–19 </w:t>
+            </w:r>
+          </w:p>
+        </w:tc>
+        <w:tc>
+          <w:tcPr>
+            <w:tcW w:type="dxa" w:w="560"/>
+            <w:shd w:fill="111111" w:color="auto" w:val="clear"/>
+            <w:tcMar>
+              <w:top w:type="dxa" w:w="70"/>
+              <w:left w:type="dxa" w:w="110"/>
+              <w:bottom w:type="dxa" w:w="70"/>
+              <w:right w:type="dxa" w:w="110"/>
+            </w:tcMar>
+          </w:tcPr>
+          <w:p>
+            <w:pPr>
+              <w:spacing w:after="0" w:before="0" w:line="250"/>
+            </w:pPr>
+            <w:r>
+              <w:rPr>
+                <w:rFonts w:ascii="Calibri" w:cs="Calibri" w:eastAsia="Calibri" w:hAnsi="Calibri"/>
+                <w:b/>
+                <w:bCs/>
+                <w:color w:val="FFFFFF"/>
+                <w:sz w:val="16"/>
+                <w:szCs w:val="16"/>
+              </w:rPr>
+              <w:t xml:space="preserve">Run</w:t>
+            </w:r>
+          </w:p>
+        </w:tc>
+        <w:tc>
+          <w:tcPr>
+            <w:tcW w:type="dxa" w:w="590"/>
+            <w:shd w:fill="111111" w:color="auto" w:val="clear"/>
+            <w:tcMar>
+              <w:top w:type="dxa" w:w="70"/>
+              <w:left w:type="dxa" w:w="110"/>
+              <w:bottom w:type="dxa" w:w="70"/>
+              <w:right w:type="dxa" w:w="110"/>
+            </w:tcMar>
+          </w:tcPr>
+          <w:p>
+            <w:pPr>
+              <w:spacing w:after="0" w:before="0" w:line="250"/>
+            </w:pPr>
+            <w:r>
+              <w:rPr>
+                <w:rFonts w:ascii="Calibri" w:cs="Calibri" w:eastAsia="Calibri" w:hAnsi="Calibri"/>
+                <w:b/>
+                <w:bCs/>
+                <w:color w:val="FFFFFF"/>
+                <w:sz w:val="16"/>
+                <w:szCs w:val="16"/>
+              </w:rPr>
+              <w:t xml:space="preserve">Tick</w:t>
+            </w:r>
+          </w:p>
+        </w:tc>
+      </w:tr>
+      <w:tr>
+        <w:tc>
+          <w:tcPr>
+            <w:tcW w:type="dxa" w:w="520"/>
+            <w:tcMar>
+              <w:top w:type="dxa" w:w="70"/>
+              <w:left w:type="dxa" w:w="110"/>
+              <w:bottom w:type="dxa" w:w="70"/>
+              <w:right w:type="dxa" w:w="110"/>
+            </w:tcMar>
+          </w:tcPr>
+          <w:p>
+            <w:pPr>
+              <w:spacing w:after="0" w:before="0" w:line="250"/>
+            </w:pPr>
+            <w:r>
+              <w:rPr>
+                <w:rFonts w:ascii="Calibri" w:cs="Calibri" w:eastAsia="Calibri" w:hAnsi="Calibri"/>
+                <w:b/>
+                <w:bCs/>
+                <w:color w:val="111111"/>
+                <w:sz w:val="16"/>
+                <w:szCs w:val="16"/>
+              </w:rPr>
+              <w:t xml:space="preserve">Q1</w:t>
+            </w:r>
+          </w:p>
+        </w:tc>
+        <w:tc>
+          <w:tcPr>
+            <w:tcW w:type="dxa" w:w="2280"/>
+            <w:tcMar>
+              <w:top w:type="dxa" w:w="70"/>
+              <w:left w:type="dxa" w:w="110"/>
+              <w:bottom w:type="dxa" w:w="70"/>
+              <w:right w:type="dxa" w:w="110"/>
+            </w:tcMar>
+          </w:tcPr>
+          <w:p>
+            <w:pPr>
+              <w:spacing w:after="0" w:before="0" w:line="250"/>
+            </w:pPr>
+            <w:r>
+              <w:rPr>
+                <w:rFonts w:ascii="Calibri" w:cs="Calibri" w:eastAsia="Calibri" w:hAnsi="Calibri"/>
+                <w:color w:val="111111"/>
+                <w:sz w:val="16"/>
+                <w:szCs w:val="16"/>
+              </w:rPr>
+              <w:t xml:space="preserve">Look at the red line on the calendar.</w:t>
+            </w:r>
+          </w:p>
+        </w:tc>
+        <w:tc>
+          <w:tcPr>
+            <w:tcW w:type="dxa" w:w="1960"/>
+            <w:tcMar>
+              <w:top w:type="dxa" w:w="70"/>
+              <w:left w:type="dxa" w:w="110"/>
+              <w:bottom w:type="dxa" w:w="70"/>
+              <w:right w:type="dxa" w:w="110"/>
+            </w:tcMar>
+          </w:tcPr>
+          <w:p>
+            <w:pPr>
+              <w:spacing w:after="0" w:before="0" w:line="250"/>
+            </w:pPr>
+            <w:r>
+              <w:rPr>
+                <w:rFonts w:ascii="Calibri" w:cs="Calibri" w:eastAsia="Calibri" w:hAnsi="Calibri"/>
+                <w:color w:val="111111"/>
+                <w:sz w:val="16"/>
+                <w:szCs w:val="16"/>
+              </w:rPr>
+              <w:t xml:space="preserve">Sits at the correct Dubai time and moves as the day passes.</w:t>
+            </w:r>
+          </w:p>
+        </w:tc>
+        <w:tc>
+          <w:tcPr>
+            <w:tcW w:type="dxa" w:w="3116"/>
+            <w:tcMar>
+              <w:top w:type="dxa" w:w="70"/>
+              <w:left w:type="dxa" w:w="110"/>
+              <w:bottom w:type="dxa" w:w="70"/>
+              <w:right w:type="dxa" w:w="110"/>
+            </w:tcMar>
+          </w:tcPr>
+          <w:p>
+            <w:pPr>
+              <w:spacing w:after="0" w:before="0" w:line="250"/>
+            </w:pPr>
+            <w:r>
+              <w:rPr>
+                <w:rFonts w:ascii="Calibri" w:cs="Calibri" w:eastAsia="Calibri" w:hAnsi="Calibri"/>
+                <w:color w:val="111111"/>
+                <w:sz w:val="16"/>
+                <w:szCs w:val="16"/>
+              </w:rPr>
+              <w:t xml:space="preserve">Reads salon time and refreshes every minute.</w:t>
+            </w:r>
+          </w:p>
+        </w:tc>
+        <w:tc>
+          <w:tcPr>
+            <w:tcW w:type="dxa" w:w="560"/>
+            <w:tcMar>
+              <w:top w:type="dxa" w:w="70"/>
+              <w:left w:type="dxa" w:w="110"/>
+              <w:bottom w:type="dxa" w:w="70"/>
+              <w:right w:type="dxa" w:w="110"/>
+            </w:tcMar>
+          </w:tcPr>
+          <w:p>
+            <w:pPr>
+              <w:spacing w:after="0" w:before="0" w:line="250"/>
+              <w:jc w:val="center"/>
+            </w:pPr>
+            <w:r>
+              <w:rPr>
+                <w:rFonts w:ascii="Calibri" w:cs="Calibri" w:eastAsia="Calibri" w:hAnsi="Calibri"/>
+                <w:b/>
+                <w:bCs/>
+                <w:color w:val="1E6B3A"/>
+                <w:sz w:val="15"/>
+                <w:szCs w:val="15"/>
+              </w:rPr>
+              <w:t xml:space="preserve">Pass</w:t>
+            </w:r>
+          </w:p>
+        </w:tc>
+        <w:tc>
+          <w:tcPr>
+            <w:tcW w:type="dxa" w:w="590"/>
+            <w:tcMar>
+              <w:top w:type="dxa" w:w="70"/>
+              <w:left w:type="dxa" w:w="110"/>
+              <w:bottom w:type="dxa" w:w="70"/>
+              <w:right w:type="dxa" w:w="110"/>
+            </w:tcMar>
+          </w:tcPr>
+          <w:p>
+            <w:pPr>
+              <w:spacing w:after="0" w:before="0" w:line="250"/>
+            </w:pPr>
+            <w:r>
+              <w:rPr>
+                <w:rFonts w:ascii="Calibri" w:cs="Calibri" w:eastAsia="Calibri" w:hAnsi="Calibri"/>
+                <w:color w:val="111111"/>
+                <w:sz w:val="17"/>
+                <w:szCs w:val="17"/>
+              </w:rPr>
+              <w:t xml:space="preserve"> </w:t>
+            </w:r>
+          </w:p>
+        </w:tc>
+      </w:tr>
+      <w:tr>
+        <w:tc>
+          <w:tcPr>
+            <w:tcW w:type="dxa" w:w="520"/>
+            <w:tcMar>
+              <w:top w:type="dxa" w:w="70"/>
+              <w:left w:type="dxa" w:w="110"/>
+              <w:bottom w:type="dxa" w:w="70"/>
+              <w:right w:type="dxa" w:w="110"/>
+            </w:tcMar>
+          </w:tcPr>
+          <w:p>
+            <w:pPr>
+              <w:spacing w:after="0" w:before="0" w:line="250"/>
+            </w:pPr>
+            <w:r>
+              <w:rPr>
+                <w:rFonts w:ascii="Calibri" w:cs="Calibri" w:eastAsia="Calibri" w:hAnsi="Calibri"/>
+                <w:b/>
+                <w:bCs/>
+                <w:color w:val="111111"/>
+                <w:sz w:val="16"/>
+                <w:szCs w:val="16"/>
+              </w:rPr>
+              <w:t xml:space="preserve">Q2</w:t>
+            </w:r>
+          </w:p>
+        </w:tc>
+        <w:tc>
+          <w:tcPr>
+            <w:tcW w:type="dxa" w:w="2280"/>
+            <w:tcMar>
+              <w:top w:type="dxa" w:w="70"/>
+              <w:left w:type="dxa" w:w="110"/>
+              <w:bottom w:type="dxa" w:w="70"/>
+              <w:right w:type="dxa" w:w="110"/>
+            </w:tcMar>
+          </w:tcPr>
+          <w:p>
+            <w:pPr>
+              <w:spacing w:after="0" w:before="0" w:line="250"/>
+            </w:pPr>
+            <w:r>
+              <w:rPr>
+                <w:rFonts w:ascii="Calibri" w:cs="Calibri" w:eastAsia="Calibri" w:hAnsi="Calibri"/>
+                <w:color w:val="111111"/>
+                <w:sz w:val="16"/>
+                <w:szCs w:val="16"/>
+              </w:rPr>
+              <w:t xml:space="preserve">Look at yesterday, then a date last month.</w:t>
+            </w:r>
+          </w:p>
+        </w:tc>
+        <w:tc>
+          <w:tcPr>
+            <w:tcW w:type="dxa" w:w="1960"/>
+            <w:tcMar>
+              <w:top w:type="dxa" w:w="70"/>
+              <w:left w:type="dxa" w:w="110"/>
+              <w:bottom w:type="dxa" w:w="70"/>
+              <w:right w:type="dxa" w:w="110"/>
+            </w:tcMar>
+          </w:tcPr>
+          <w:p>
+            <w:pPr>
+              <w:spacing w:after="0" w:before="0" w:line="250"/>
+            </w:pPr>
+            <w:r>
+              <w:rPr>
+                <w:rFonts w:ascii="Calibri" w:cs="Calibri" w:eastAsia="Calibri" w:hAnsi="Calibri"/>
+                <w:color w:val="111111"/>
+                <w:sz w:val="16"/>
+                <w:szCs w:val="16"/>
+              </w:rPr>
+              <w:t xml:space="preserve">The arrows move a day at a time; clicking the date opens a picker for any date.</w:t>
+            </w:r>
+          </w:p>
+        </w:tc>
+        <w:tc>
+          <w:tcPr>
+            <w:tcW w:type="dxa" w:w="3116"/>
+            <w:tcMar>
+              <w:top w:type="dxa" w:w="70"/>
+              <w:left w:type="dxa" w:w="110"/>
+              <w:bottom w:type="dxa" w:w="70"/>
+              <w:right w:type="dxa" w:w="110"/>
+            </w:tcMar>
+          </w:tcPr>
+          <w:p>
+            <w:pPr>
+              <w:spacing w:after="0" w:before="0" w:line="250"/>
+            </w:pPr>
+            <w:r>
+              <w:rPr>
+                <w:rFonts w:ascii="Calibri" w:cs="Calibri" w:eastAsia="Calibri" w:hAnsi="Calibri"/>
+                <w:color w:val="111111"/>
+                <w:sz w:val="16"/>
+                <w:szCs w:val="16"/>
+              </w:rPr>
+              <w:t xml:space="preserve">Both work. A date ten days back returned that day’s nine appointments.</w:t>
+            </w:r>
+          </w:p>
+        </w:tc>
+        <w:tc>
+          <w:tcPr>
+            <w:tcW w:type="dxa" w:w="560"/>
+            <w:tcMar>
+              <w:top w:type="dxa" w:w="70"/>
+              <w:left w:type="dxa" w:w="110"/>
+              <w:bottom w:type="dxa" w:w="70"/>
+              <w:right w:type="dxa" w:w="110"/>
+            </w:tcMar>
+          </w:tcPr>
+          <w:p>
+            <w:pPr>
+              <w:spacing w:after="0" w:before="0" w:line="250"/>
+              <w:jc w:val="center"/>
+            </w:pPr>
+            <w:r>
+              <w:rPr>
+                <w:rFonts w:ascii="Calibri" w:cs="Calibri" w:eastAsia="Calibri" w:hAnsi="Calibri"/>
+                <w:b/>
+                <w:bCs/>
+                <w:color w:val="1E6B3A"/>
+                <w:sz w:val="15"/>
+                <w:szCs w:val="15"/>
+              </w:rPr>
+              <w:t xml:space="preserve">Pass</w:t>
+            </w:r>
+          </w:p>
+        </w:tc>
+        <w:tc>
+          <w:tcPr>
+            <w:tcW w:type="dxa" w:w="590"/>
+            <w:tcMar>
+              <w:top w:type="dxa" w:w="70"/>
+              <w:left w:type="dxa" w:w="110"/>
+              <w:bottom w:type="dxa" w:w="70"/>
+              <w:right w:type="dxa" w:w="110"/>
+            </w:tcMar>
+          </w:tcPr>
+          <w:p>
+            <w:pPr>
+              <w:spacing w:after="0" w:before="0" w:line="250"/>
+            </w:pPr>
+            <w:r>
+              <w:rPr>
+                <w:rFonts w:ascii="Calibri" w:cs="Calibri" w:eastAsia="Calibri" w:hAnsi="Calibri"/>
+                <w:color w:val="111111"/>
+                <w:sz w:val="17"/>
+                <w:szCs w:val="17"/>
+              </w:rPr>
+              <w:t xml:space="preserve"> </w:t>
+            </w:r>
+          </w:p>
+        </w:tc>
+      </w:tr>
+      <w:tr>
+        <w:tc>
+          <w:tcPr>
+            <w:tcW w:type="dxa" w:w="520"/>
+            <w:tcMar>
+              <w:top w:type="dxa" w:w="70"/>
+              <w:left w:type="dxa" w:w="110"/>
+              <w:bottom w:type="dxa" w:w="70"/>
+              <w:right w:type="dxa" w:w="110"/>
+            </w:tcMar>
+          </w:tcPr>
+          <w:p>
+            <w:pPr>
+              <w:spacing w:after="0" w:before="0" w:line="250"/>
+            </w:pPr>
+            <w:r>
+              <w:rPr>
+                <w:rFonts w:ascii="Calibri" w:cs="Calibri" w:eastAsia="Calibri" w:hAnsi="Calibri"/>
+                <w:b/>
+                <w:bCs/>
+                <w:color w:val="111111"/>
+                <w:sz w:val="16"/>
+                <w:szCs w:val="16"/>
+              </w:rPr>
+              <w:t xml:space="preserve">Q3</w:t>
+            </w:r>
+          </w:p>
+        </w:tc>
+        <w:tc>
+          <w:tcPr>
+            <w:tcW w:type="dxa" w:w="2280"/>
+            <w:tcMar>
+              <w:top w:type="dxa" w:w="70"/>
+              <w:left w:type="dxa" w:w="110"/>
+              <w:bottom w:type="dxa" w:w="70"/>
+              <w:right w:type="dxa" w:w="110"/>
+            </w:tcMar>
+          </w:tcPr>
+          <w:p>
+            <w:pPr>
+              <w:spacing w:after="0" w:before="0" w:line="250"/>
+            </w:pPr>
+            <w:r>
+              <w:rPr>
+                <w:rFonts w:ascii="Calibri" w:cs="Calibri" w:eastAsia="Calibri" w:hAnsi="Calibri"/>
+                <w:color w:val="111111"/>
+                <w:sz w:val="16"/>
+                <w:szCs w:val="16"/>
+              </w:rPr>
+              <w:t xml:space="preserve">Switch to the Month view.</w:t>
+            </w:r>
+          </w:p>
+        </w:tc>
+        <w:tc>
+          <w:tcPr>
+            <w:tcW w:type="dxa" w:w="1960"/>
+            <w:tcMar>
+              <w:top w:type="dxa" w:w="70"/>
+              <w:left w:type="dxa" w:w="110"/>
+              <w:bottom w:type="dxa" w:w="70"/>
+              <w:right w:type="dxa" w:w="110"/>
+            </w:tcMar>
+          </w:tcPr>
+          <w:p>
+            <w:pPr>
+              <w:spacing w:after="0" w:before="0" w:line="250"/>
+            </w:pPr>
+            <w:r>
+              <w:rPr>
+                <w:rFonts w:ascii="Calibri" w:cs="Calibri" w:eastAsia="Calibri" w:hAnsi="Calibri"/>
+                <w:color w:val="111111"/>
+                <w:sz w:val="16"/>
+                <w:szCs w:val="16"/>
+              </w:rPr>
+              <w:t xml:space="preserve">A month at a glance with appointments per day, and takings per day for the owner.</w:t>
+            </w:r>
+          </w:p>
+        </w:tc>
+        <w:tc>
+          <w:tcPr>
+            <w:tcW w:type="dxa" w:w="3116"/>
+            <w:tcMar>
+              <w:top w:type="dxa" w:w="70"/>
+              <w:left w:type="dxa" w:w="110"/>
+              <w:bottom w:type="dxa" w:w="70"/>
+              <w:right w:type="dxa" w:w="110"/>
+            </w:tcMar>
+          </w:tcPr>
+          <w:p>
+            <w:pPr>
+              <w:spacing w:after="0" w:before="0" w:line="250"/>
+            </w:pPr>
+            <w:r>
+              <w:rPr>
+                <w:rFonts w:ascii="Calibri" w:cs="Calibri" w:eastAsia="Calibri" w:hAnsi="Calibri"/>
+                <w:color w:val="111111"/>
+                <w:sz w:val="16"/>
+                <w:szCs w:val="16"/>
+              </w:rPr>
+              <w:t xml:space="preserve">22 trading days shown with counts, no-shows and cancellations.</w:t>
+            </w:r>
+          </w:p>
+        </w:tc>
+        <w:tc>
+          <w:tcPr>
+            <w:tcW w:type="dxa" w:w="560"/>
+            <w:tcMar>
+              <w:top w:type="dxa" w:w="70"/>
+              <w:left w:type="dxa" w:w="110"/>
+              <w:bottom w:type="dxa" w:w="70"/>
+              <w:right w:type="dxa" w:w="110"/>
+            </w:tcMar>
+          </w:tcPr>
+          <w:p>
+            <w:pPr>
+              <w:spacing w:after="0" w:before="0" w:line="250"/>
+              <w:jc w:val="center"/>
+            </w:pPr>
+            <w:r>
+              <w:rPr>
+                <w:rFonts w:ascii="Calibri" w:cs="Calibri" w:eastAsia="Calibri" w:hAnsi="Calibri"/>
+                <w:b/>
+                <w:bCs/>
+                <w:color w:val="1E6B3A"/>
+                <w:sz w:val="15"/>
+                <w:szCs w:val="15"/>
+              </w:rPr>
+              <w:t xml:space="preserve">Pass</w:t>
+            </w:r>
+          </w:p>
+        </w:tc>
+        <w:tc>
+          <w:tcPr>
+            <w:tcW w:type="dxa" w:w="590"/>
+            <w:tcMar>
+              <w:top w:type="dxa" w:w="70"/>
+              <w:left w:type="dxa" w:w="110"/>
+              <w:bottom w:type="dxa" w:w="70"/>
+              <w:right w:type="dxa" w:w="110"/>
+            </w:tcMar>
+          </w:tcPr>
+          <w:p>
+            <w:pPr>
+              <w:spacing w:after="0" w:before="0" w:line="250"/>
+            </w:pPr>
+            <w:r>
+              <w:rPr>
+                <w:rFonts w:ascii="Calibri" w:cs="Calibri" w:eastAsia="Calibri" w:hAnsi="Calibri"/>
+                <w:color w:val="111111"/>
+                <w:sz w:val="17"/>
+                <w:szCs w:val="17"/>
+              </w:rPr>
+              <w:t xml:space="preserve"> </w:t>
+            </w:r>
+          </w:p>
+        </w:tc>
+      </w:tr>
+      <w:tr>
+        <w:tc>
+          <w:tcPr>
+            <w:tcW w:type="dxa" w:w="520"/>
+            <w:tcMar>
+              <w:top w:type="dxa" w:w="70"/>
+              <w:left w:type="dxa" w:w="110"/>
+              <w:bottom w:type="dxa" w:w="70"/>
+              <w:right w:type="dxa" w:w="110"/>
+            </w:tcMar>
+          </w:tcPr>
+          <w:p>
+            <w:pPr>
+              <w:spacing w:after="0" w:before="0" w:line="250"/>
+            </w:pPr>
+            <w:r>
+              <w:rPr>
+                <w:rFonts w:ascii="Calibri" w:cs="Calibri" w:eastAsia="Calibri" w:hAnsi="Calibri"/>
+                <w:b/>
+                <w:bCs/>
+                <w:color w:val="111111"/>
+                <w:sz w:val="16"/>
+                <w:szCs w:val="16"/>
+              </w:rPr>
+              <w:t xml:space="preserve">Q4</w:t>
+            </w:r>
+          </w:p>
+        </w:tc>
+        <w:tc>
+          <w:tcPr>
+            <w:tcW w:type="dxa" w:w="2280"/>
+            <w:tcMar>
+              <w:top w:type="dxa" w:w="70"/>
+              <w:left w:type="dxa" w:w="110"/>
+              <w:bottom w:type="dxa" w:w="70"/>
+              <w:right w:type="dxa" w:w="110"/>
+            </w:tcMar>
+          </w:tcPr>
+          <w:p>
+            <w:pPr>
+              <w:spacing w:after="0" w:before="0" w:line="250"/>
+            </w:pPr>
+            <w:r>
+              <w:rPr>
+                <w:rFonts w:ascii="Calibri" w:cs="Calibri" w:eastAsia="Calibri" w:hAnsi="Calibri"/>
+                <w:color w:val="111111"/>
+                <w:sz w:val="16"/>
+                <w:szCs w:val="16"/>
+              </w:rPr>
+              <w:t xml:space="preserve">As reception, open the Month view.</w:t>
+            </w:r>
+          </w:p>
+        </w:tc>
+        <w:tc>
+          <w:tcPr>
+            <w:tcW w:type="dxa" w:w="1960"/>
+            <w:tcMar>
+              <w:top w:type="dxa" w:w="70"/>
+              <w:left w:type="dxa" w:w="110"/>
+              <w:bottom w:type="dxa" w:w="70"/>
+              <w:right w:type="dxa" w:w="110"/>
+            </w:tcMar>
+          </w:tcPr>
+          <w:p>
+            <w:pPr>
+              <w:spacing w:after="0" w:before="0" w:line="250"/>
+            </w:pPr>
+            <w:r>
+              <w:rPr>
+                <w:rFonts w:ascii="Calibri" w:cs="Calibri" w:eastAsia="Calibri" w:hAnsi="Calibri"/>
+                <w:color w:val="111111"/>
+                <w:sz w:val="16"/>
+                <w:szCs w:val="16"/>
+              </w:rPr>
+              <w:t xml:space="preserve">Counts but no money — turnover is the owner’s.</w:t>
+            </w:r>
+          </w:p>
+        </w:tc>
+        <w:tc>
+          <w:tcPr>
+            <w:tcW w:type="dxa" w:w="3116"/>
+            <w:tcMar>
+              <w:top w:type="dxa" w:w="70"/>
+              <w:left w:type="dxa" w:w="110"/>
+              <w:bottom w:type="dxa" w:w="70"/>
+              <w:right w:type="dxa" w:w="110"/>
+            </w:tcMar>
+          </w:tcPr>
+          <w:p>
+            <w:pPr>
+              <w:spacing w:after="0" w:before="0" w:line="250"/>
+            </w:pPr>
+            <w:r>
+              <w:rPr>
+                <w:rFonts w:ascii="Calibri" w:cs="Calibri" w:eastAsia="Calibri" w:hAnsi="Calibri"/>
+                <w:color w:val="111111"/>
+                <w:sz w:val="16"/>
+                <w:szCs w:val="16"/>
+              </w:rPr>
+              <w:t xml:space="preserve">Revenue omitted entirely for reception, enforced by the server.</w:t>
+            </w:r>
+          </w:p>
+        </w:tc>
+        <w:tc>
+          <w:tcPr>
+            <w:tcW w:type="dxa" w:w="560"/>
+            <w:tcMar>
+              <w:top w:type="dxa" w:w="70"/>
+              <w:left w:type="dxa" w:w="110"/>
+              <w:bottom w:type="dxa" w:w="70"/>
+              <w:right w:type="dxa" w:w="110"/>
+            </w:tcMar>
+          </w:tcPr>
+          <w:p>
+            <w:pPr>
+              <w:spacing w:after="0" w:before="0" w:line="250"/>
+              <w:jc w:val="center"/>
+            </w:pPr>
+            <w:r>
+              <w:rPr>
+                <w:rFonts w:ascii="Calibri" w:cs="Calibri" w:eastAsia="Calibri" w:hAnsi="Calibri"/>
+                <w:b/>
+                <w:bCs/>
+                <w:color w:val="1E6B3A"/>
+                <w:sz w:val="15"/>
+                <w:szCs w:val="15"/>
+              </w:rPr>
+              <w:t xml:space="preserve">Pass</w:t>
+            </w:r>
+          </w:p>
+        </w:tc>
+        <w:tc>
+          <w:tcPr>
+            <w:tcW w:type="dxa" w:w="590"/>
+            <w:tcMar>
+              <w:top w:type="dxa" w:w="70"/>
+              <w:left w:type="dxa" w:w="110"/>
+              <w:bottom w:type="dxa" w:w="70"/>
+              <w:right w:type="dxa" w:w="110"/>
+            </w:tcMar>
+          </w:tcPr>
+          <w:p>
+            <w:pPr>
+              <w:spacing w:after="0" w:before="0" w:line="250"/>
+            </w:pPr>
+            <w:r>
+              <w:rPr>
+                <w:rFonts w:ascii="Calibri" w:cs="Calibri" w:eastAsia="Calibri" w:hAnsi="Calibri"/>
+                <w:color w:val="111111"/>
+                <w:sz w:val="17"/>
+                <w:szCs w:val="17"/>
+              </w:rPr>
+              <w:t xml:space="preserve"> </w:t>
+            </w:r>
+          </w:p>
+        </w:tc>
+      </w:tr>
+      <w:tr>
+        <w:tc>
+          <w:tcPr>
+            <w:tcW w:type="dxa" w:w="520"/>
+            <w:tcMar>
+              <w:top w:type="dxa" w:w="70"/>
+              <w:left w:type="dxa" w:w="110"/>
+              <w:bottom w:type="dxa" w:w="70"/>
+              <w:right w:type="dxa" w:w="110"/>
+            </w:tcMar>
+          </w:tcPr>
+          <w:p>
+            <w:pPr>
+              <w:spacing w:after="0" w:before="0" w:line="250"/>
+            </w:pPr>
+            <w:r>
+              <w:rPr>
+                <w:rFonts w:ascii="Calibri" w:cs="Calibri" w:eastAsia="Calibri" w:hAnsi="Calibri"/>
+                <w:b/>
+                <w:bCs/>
+                <w:color w:val="111111"/>
+                <w:sz w:val="16"/>
+                <w:szCs w:val="16"/>
+              </w:rPr>
+              <w:t xml:space="preserve">Q5</w:t>
+            </w:r>
+          </w:p>
+        </w:tc>
+        <w:tc>
+          <w:tcPr>
+            <w:tcW w:type="dxa" w:w="2280"/>
+            <w:tcMar>
+              <w:top w:type="dxa" w:w="70"/>
+              <w:left w:type="dxa" w:w="110"/>
+              <w:bottom w:type="dxa" w:w="70"/>
+              <w:right w:type="dxa" w:w="110"/>
+            </w:tcMar>
+          </w:tcPr>
+          <w:p>
+            <w:pPr>
+              <w:spacing w:after="0" w:before="0" w:line="250"/>
+            </w:pPr>
+            <w:r>
+              <w:rPr>
+                <w:rFonts w:ascii="Calibri" w:cs="Calibri" w:eastAsia="Calibri" w:hAnsi="Calibri"/>
+                <w:color w:val="111111"/>
+                <w:sz w:val="16"/>
+                <w:szCs w:val="16"/>
+              </w:rPr>
+              <w:t xml:space="preserve">As reception, try to view another branch’s month.</w:t>
+            </w:r>
+          </w:p>
+        </w:tc>
+        <w:tc>
+          <w:tcPr>
+            <w:tcW w:type="dxa" w:w="1960"/>
+            <w:tcMar>
+              <w:top w:type="dxa" w:w="70"/>
+              <w:left w:type="dxa" w:w="110"/>
+              <w:bottom w:type="dxa" w:w="70"/>
+              <w:right w:type="dxa" w:w="110"/>
+            </w:tcMar>
+          </w:tcPr>
+          <w:p>
+            <w:pPr>
+              <w:spacing w:after="0" w:before="0" w:line="250"/>
+            </w:pPr>
+            <w:r>
+              <w:rPr>
+                <w:rFonts w:ascii="Calibri" w:cs="Calibri" w:eastAsia="Calibri" w:hAnsi="Calibri"/>
+                <w:color w:val="111111"/>
+                <w:sz w:val="16"/>
+                <w:szCs w:val="16"/>
+              </w:rPr>
+              <w:t xml:space="preserve">Your own branch is shown whatever you ask for.</w:t>
+            </w:r>
+          </w:p>
+        </w:tc>
+        <w:tc>
+          <w:tcPr>
+            <w:tcW w:type="dxa" w:w="3116"/>
+            <w:tcMar>
+              <w:top w:type="dxa" w:w="70"/>
+              <w:left w:type="dxa" w:w="110"/>
+              <w:bottom w:type="dxa" w:w="70"/>
+              <w:right w:type="dxa" w:w="110"/>
+            </w:tcMar>
+          </w:tcPr>
+          <w:p>
+            <w:pPr>
+              <w:spacing w:after="0" w:before="0" w:line="250"/>
+            </w:pPr>
+            <w:r>
+              <w:rPr>
+                <w:rFonts w:ascii="Calibri" w:cs="Calibri" w:eastAsia="Calibri" w:hAnsi="Calibri"/>
+                <w:color w:val="111111"/>
+                <w:sz w:val="16"/>
+                <w:szCs w:val="16"/>
+              </w:rPr>
+              <w:t xml:space="preserve">Asked for City Centre, received Marina Walk.</w:t>
+            </w:r>
+          </w:p>
+        </w:tc>
+        <w:tc>
+          <w:tcPr>
+            <w:tcW w:type="dxa" w:w="560"/>
+            <w:tcMar>
+              <w:top w:type="dxa" w:w="70"/>
+              <w:left w:type="dxa" w:w="110"/>
+              <w:bottom w:type="dxa" w:w="70"/>
+              <w:right w:type="dxa" w:w="110"/>
+            </w:tcMar>
+          </w:tcPr>
+          <w:p>
+            <w:pPr>
+              <w:spacing w:after="0" w:before="0" w:line="250"/>
+              <w:jc w:val="center"/>
+            </w:pPr>
+            <w:r>
+              <w:rPr>
+                <w:rFonts w:ascii="Calibri" w:cs="Calibri" w:eastAsia="Calibri" w:hAnsi="Calibri"/>
+                <w:b/>
+                <w:bCs/>
+                <w:color w:val="1E6B3A"/>
+                <w:sz w:val="15"/>
+                <w:szCs w:val="15"/>
+              </w:rPr>
+              <w:t xml:space="preserve">Pass</w:t>
+            </w:r>
+          </w:p>
+        </w:tc>
+        <w:tc>
+          <w:tcPr>
+            <w:tcW w:type="dxa" w:w="590"/>
+            <w:tcMar>
+              <w:top w:type="dxa" w:w="70"/>
+              <w:left w:type="dxa" w:w="110"/>
+              <w:bottom w:type="dxa" w:w="70"/>
+              <w:right w:type="dxa" w:w="110"/>
+            </w:tcMar>
+          </w:tcPr>
+          <w:p>
+            <w:pPr>
+              <w:spacing w:after="0" w:before="0" w:line="250"/>
+            </w:pPr>
+            <w:r>
+              <w:rPr>
+                <w:rFonts w:ascii="Calibri" w:cs="Calibri" w:eastAsia="Calibri" w:hAnsi="Calibri"/>
+                <w:color w:val="111111"/>
+                <w:sz w:val="17"/>
+                <w:szCs w:val="17"/>
+              </w:rPr>
+              <w:t xml:space="preserve"> </w:t>
+            </w:r>
+          </w:p>
+        </w:tc>
+      </w:tr>
+      <w:tr>
+        <w:tc>
+          <w:tcPr>
+            <w:tcW w:type="dxa" w:w="520"/>
+            <w:tcMar>
+              <w:top w:type="dxa" w:w="70"/>
+              <w:left w:type="dxa" w:w="110"/>
+              <w:bottom w:type="dxa" w:w="70"/>
+              <w:right w:type="dxa" w:w="110"/>
+            </w:tcMar>
+          </w:tcPr>
+          <w:p>
+            <w:pPr>
+              <w:spacing w:after="0" w:before="0" w:line="250"/>
+            </w:pPr>
+            <w:r>
+              <w:rPr>
+                <w:rFonts w:ascii="Calibri" w:cs="Calibri" w:eastAsia="Calibri" w:hAnsi="Calibri"/>
+                <w:b/>
+                <w:bCs/>
+                <w:color w:val="111111"/>
+                <w:sz w:val="16"/>
+                <w:szCs w:val="16"/>
+              </w:rPr>
+              <w:t xml:space="preserve">Q6</w:t>
+            </w:r>
+          </w:p>
+        </w:tc>
+        <w:tc>
+          <w:tcPr>
+            <w:tcW w:type="dxa" w:w="2280"/>
+            <w:tcMar>
+              <w:top w:type="dxa" w:w="70"/>
+              <w:left w:type="dxa" w:w="110"/>
+              <w:bottom w:type="dxa" w:w="70"/>
+              <w:right w:type="dxa" w:w="110"/>
+            </w:tcMar>
+          </w:tcPr>
+          <w:p>
+            <w:pPr>
+              <w:spacing w:after="0" w:before="0" w:line="250"/>
+            </w:pPr>
+            <w:r>
+              <w:rPr>
+                <w:rFonts w:ascii="Calibri" w:cs="Calibri" w:eastAsia="Calibri" w:hAnsi="Calibri"/>
+                <w:color w:val="111111"/>
+                <w:sz w:val="16"/>
+                <w:szCs w:val="16"/>
+              </w:rPr>
+              <w:t xml:space="preserve">Click a day in the month grid.</w:t>
+            </w:r>
+          </w:p>
+        </w:tc>
+        <w:tc>
+          <w:tcPr>
+            <w:tcW w:type="dxa" w:w="1960"/>
+            <w:tcMar>
+              <w:top w:type="dxa" w:w="70"/>
+              <w:left w:type="dxa" w:w="110"/>
+              <w:bottom w:type="dxa" w:w="70"/>
+              <w:right w:type="dxa" w:w="110"/>
+            </w:tcMar>
+          </w:tcPr>
+          <w:p>
+            <w:pPr>
+              <w:spacing w:after="0" w:before="0" w:line="250"/>
+            </w:pPr>
+            <w:r>
+              <w:rPr>
+                <w:rFonts w:ascii="Calibri" w:cs="Calibri" w:eastAsia="Calibri" w:hAnsi="Calibri"/>
+                <w:color w:val="111111"/>
+                <w:sz w:val="16"/>
+                <w:szCs w:val="16"/>
+              </w:rPr>
+              <w:t xml:space="preserve">Opens that day’s diary.</w:t>
+            </w:r>
+          </w:p>
+        </w:tc>
+        <w:tc>
+          <w:tcPr>
+            <w:tcW w:type="dxa" w:w="3116"/>
+            <w:tcMar>
+              <w:top w:type="dxa" w:w="70"/>
+              <w:left w:type="dxa" w:w="110"/>
+              <w:bottom w:type="dxa" w:w="70"/>
+              <w:right w:type="dxa" w:w="110"/>
+            </w:tcMar>
+          </w:tcPr>
+          <w:p>
+            <w:pPr>
+              <w:spacing w:after="0" w:before="0" w:line="250"/>
+            </w:pPr>
+            <w:r>
+              <w:rPr>
+                <w:rFonts w:ascii="Calibri" w:cs="Calibri" w:eastAsia="Calibri" w:hAnsi="Calibri"/>
+                <w:color w:val="111111"/>
+                <w:sz w:val="16"/>
+                <w:szCs w:val="16"/>
+              </w:rPr>
+              <w:t xml:space="preserve">Works, and Today returns you to the current day.</w:t>
+            </w:r>
+          </w:p>
+        </w:tc>
+        <w:tc>
+          <w:tcPr>
+            <w:tcW w:type="dxa" w:w="560"/>
+            <w:tcMar>
+              <w:top w:type="dxa" w:w="70"/>
+              <w:left w:type="dxa" w:w="110"/>
+              <w:bottom w:type="dxa" w:w="70"/>
+              <w:right w:type="dxa" w:w="110"/>
+            </w:tcMar>
+          </w:tcPr>
+          <w:p>
+            <w:pPr>
+              <w:spacing w:after="0" w:before="0" w:line="250"/>
+              <w:jc w:val="center"/>
+            </w:pPr>
+            <w:r>
+              <w:rPr>
+                <w:rFonts w:ascii="Calibri" w:cs="Calibri" w:eastAsia="Calibri" w:hAnsi="Calibri"/>
+                <w:b/>
+                <w:bCs/>
+                <w:color w:val="1E6B3A"/>
+                <w:sz w:val="15"/>
+                <w:szCs w:val="15"/>
+              </w:rPr>
+              <w:t xml:space="preserve">Pass</w:t>
+            </w:r>
+          </w:p>
+        </w:tc>
+        <w:tc>
+          <w:tcPr>
+            <w:tcW w:type="dxa" w:w="590"/>
+            <w:tcMar>
+              <w:top w:type="dxa" w:w="70"/>
+              <w:left w:type="dxa" w:w="110"/>
+              <w:bottom w:type="dxa" w:w="70"/>
+              <w:right w:type="dxa" w:w="110"/>
+            </w:tcMar>
+          </w:tcPr>
+          <w:p>
+            <w:pPr>
+              <w:spacing w:after="0" w:before="0" w:line="250"/>
+            </w:pPr>
+            <w:r>
+              <w:rPr>
+                <w:rFonts w:ascii="Calibri" w:cs="Calibri" w:eastAsia="Calibri" w:hAnsi="Calibri"/>
+                <w:color w:val="111111"/>
+                <w:sz w:val="17"/>
+                <w:szCs w:val="17"/>
+              </w:rPr>
+              <w:t xml:space="preserve"> </w:t>
+            </w:r>
+          </w:p>
+        </w:tc>
+      </w:tr>
+    </w:tbl>
+    <w:p>
+      <w:pPr>
+        <w:spacing w:after="160"/>
+      </w:pPr>
+    </w:p>
+    <w:p>
+      <w:pPr>
+        <w:pStyle w:val="Heading2"/>
+        <w:spacing w:after="120" w:before="280"/>
+      </w:pPr>
+      <w:r>
+        <w:rPr>
+          <w:rFonts w:ascii="Calibri" w:cs="Calibri" w:eastAsia="Calibri" w:hAnsi="Calibri"/>
+          <w:b/>
+          <w:bCs/>
+          <w:color w:val="8A6D1F"/>
+          <w:sz w:val="24"/>
+          <w:szCs w:val="24"/>
+        </w:rPr>
+        <w:t xml:space="preserve">R · Walk-in clients</w:t>
+      </w:r>
+    </w:p>
+    <w:tbl>
+      <w:tblPr>
+        <w:tblW w:type="dxa" w:w="9026"/>
+        <w:tblBorders>
+          <w:top w:val="single" w:color="D8D4C8" w:sz="2"/>
+          <w:left w:val="none"/>
+          <w:bottom w:val="single" w:color="D8D4C8" w:sz="2"/>
+          <w:right w:val="none"/>
+          <w:insideH w:val="single" w:color="D8D4C8" w:sz="2"/>
+          <w:insideV w:val="none"/>
+        </w:tblBorders>
+      </w:tblPr>
+      <w:tblGrid>
+        <w:gridCol w:w="520"/>
+        <w:gridCol w:w="2280"/>
+        <w:gridCol w:w="1960"/>
+        <w:gridCol w:w="3116"/>
+        <w:gridCol w:w="560"/>
+        <w:gridCol w:w="590"/>
+      </w:tblGrid>
+      <w:tr>
+        <w:trPr>
+          <w:tblHeader/>
+        </w:trPr>
+        <w:tc>
+          <w:tcPr>
+            <w:tcW w:type="dxa" w:w="520"/>
+            <w:shd w:fill="111111" w:color="auto" w:val="clear"/>
+            <w:tcMar>
+              <w:top w:type="dxa" w:w="70"/>
+              <w:left w:type="dxa" w:w="110"/>
+              <w:bottom w:type="dxa" w:w="70"/>
+              <w:right w:type="dxa" w:w="110"/>
+            </w:tcMar>
+          </w:tcPr>
+          <w:p>
+            <w:pPr>
+              <w:spacing w:after="0" w:before="0" w:line="250"/>
+            </w:pPr>
+            <w:r>
+              <w:rPr>
+                <w:rFonts w:ascii="Calibri" w:cs="Calibri" w:eastAsia="Calibri" w:hAnsi="Calibri"/>
+                <w:b/>
+                <w:bCs/>
+                <w:color w:val="FFFFFF"/>
+                <w:sz w:val="16"/>
+                <w:szCs w:val="16"/>
+              </w:rPr>
+              <w:t xml:space="preserve">#</w:t>
+            </w:r>
+          </w:p>
+        </w:tc>
+        <w:tc>
+          <w:tcPr>
+            <w:tcW w:type="dxa" w:w="2280"/>
+            <w:shd w:fill="111111" w:color="auto" w:val="clear"/>
+            <w:tcMar>
+              <w:top w:type="dxa" w:w="70"/>
+              <w:left w:type="dxa" w:w="110"/>
+              <w:bottom w:type="dxa" w:w="70"/>
+              <w:right w:type="dxa" w:w="110"/>
+            </w:tcMar>
+          </w:tcPr>
+          <w:p>
+            <w:pPr>
+              <w:spacing w:after="0" w:before="0" w:line="250"/>
+            </w:pPr>
+            <w:r>
+              <w:rPr>
+                <w:rFonts w:ascii="Calibri" w:cs="Calibri" w:eastAsia="Calibri" w:hAnsi="Calibri"/>
+                <w:b/>
+                <w:bCs/>
+                <w:color w:val="FFFFFF"/>
+                <w:sz w:val="16"/>
+                <w:szCs w:val="16"/>
+              </w:rPr>
+              <w:t xml:space="preserve">What to do</w:t>
+            </w:r>
+          </w:p>
+        </w:tc>
+        <w:tc>
+          <w:tcPr>
+            <w:tcW w:type="dxa" w:w="1960"/>
+            <w:shd w:fill="111111" w:color="auto" w:val="clear"/>
+            <w:tcMar>
+              <w:top w:type="dxa" w:w="70"/>
+              <w:left w:type="dxa" w:w="110"/>
+              <w:bottom w:type="dxa" w:w="70"/>
+              <w:right w:type="dxa" w:w="110"/>
+            </w:tcMar>
+          </w:tcPr>
+          <w:p>
+            <w:pPr>
+              <w:spacing w:after="0" w:before="0" w:line="250"/>
+            </w:pPr>
+            <w:r>
+              <w:rPr>
+                <w:rFonts w:ascii="Calibri" w:cs="Calibri" w:eastAsia="Calibri" w:hAnsi="Calibri"/>
+                <w:b/>
+                <w:bCs/>
+                <w:color w:val="FFFFFF"/>
+                <w:sz w:val="16"/>
+                <w:szCs w:val="16"/>
+              </w:rPr>
+              <w:t xml:space="preserve">What should happen</w:t>
+            </w:r>
+          </w:p>
+        </w:tc>
+        <w:tc>
+          <w:tcPr>
+            <w:tcW w:type="dxa" w:w="3116"/>
+            <w:shd w:fill="111111" w:color="auto" w:val="clear"/>
+            <w:tcMar>
+              <w:top w:type="dxa" w:w="70"/>
+              <w:left w:type="dxa" w:w="110"/>
+              <w:bottom w:type="dxa" w:w="70"/>
+              <w:right w:type="dxa" w:w="110"/>
+            </w:tcMar>
+          </w:tcPr>
+          <w:p>
+            <w:pPr>
+              <w:spacing w:after="0" w:before="0" w:line="250"/>
+            </w:pPr>
+            <w:r>
+              <w:rPr>
+                <w:rFonts w:ascii="Calibri" w:cs="Calibri" w:eastAsia="Calibri" w:hAnsi="Calibri"/>
+                <w:b/>
+                <w:bCs/>
+                <w:color w:val="FFFFFF"/>
+                <w:sz w:val="16"/>
+                <w:szCs w:val="16"/>
+              </w:rPr>
+              <w:t xml:space="preserve">What happened on 18–19 </w:t>
+            </w:r>
+          </w:p>
+        </w:tc>
+        <w:tc>
+          <w:tcPr>
+            <w:tcW w:type="dxa" w:w="560"/>
+            <w:shd w:fill="111111" w:color="auto" w:val="clear"/>
+            <w:tcMar>
+              <w:top w:type="dxa" w:w="70"/>
+              <w:left w:type="dxa" w:w="110"/>
+              <w:bottom w:type="dxa" w:w="70"/>
+              <w:right w:type="dxa" w:w="110"/>
+            </w:tcMar>
+          </w:tcPr>
+          <w:p>
+            <w:pPr>
+              <w:spacing w:after="0" w:before="0" w:line="250"/>
+            </w:pPr>
+            <w:r>
+              <w:rPr>
+                <w:rFonts w:ascii="Calibri" w:cs="Calibri" w:eastAsia="Calibri" w:hAnsi="Calibri"/>
+                <w:b/>
+                <w:bCs/>
+                <w:color w:val="FFFFFF"/>
+                <w:sz w:val="16"/>
+                <w:szCs w:val="16"/>
+              </w:rPr>
+              <w:t xml:space="preserve">Run</w:t>
+            </w:r>
+          </w:p>
+        </w:tc>
+        <w:tc>
+          <w:tcPr>
+            <w:tcW w:type="dxa" w:w="590"/>
+            <w:shd w:fill="111111" w:color="auto" w:val="clear"/>
+            <w:tcMar>
+              <w:top w:type="dxa" w:w="70"/>
+              <w:left w:type="dxa" w:w="110"/>
+              <w:bottom w:type="dxa" w:w="70"/>
+              <w:right w:type="dxa" w:w="110"/>
+            </w:tcMar>
+          </w:tcPr>
+          <w:p>
+            <w:pPr>
+              <w:spacing w:after="0" w:before="0" w:line="250"/>
+            </w:pPr>
+            <w:r>
+              <w:rPr>
+                <w:rFonts w:ascii="Calibri" w:cs="Calibri" w:eastAsia="Calibri" w:hAnsi="Calibri"/>
+                <w:b/>
+                <w:bCs/>
+                <w:color w:val="FFFFFF"/>
+                <w:sz w:val="16"/>
+                <w:szCs w:val="16"/>
+              </w:rPr>
+              <w:t xml:space="preserve">Tick</w:t>
+            </w:r>
+          </w:p>
+        </w:tc>
+      </w:tr>
+      <w:tr>
+        <w:tc>
+          <w:tcPr>
+            <w:tcW w:type="dxa" w:w="520"/>
+            <w:tcMar>
+              <w:top w:type="dxa" w:w="70"/>
+              <w:left w:type="dxa" w:w="110"/>
+              <w:bottom w:type="dxa" w:w="70"/>
+              <w:right w:type="dxa" w:w="110"/>
+            </w:tcMar>
+          </w:tcPr>
+          <w:p>
+            <w:pPr>
+              <w:spacing w:after="0" w:before="0" w:line="250"/>
+            </w:pPr>
+            <w:r>
+              <w:rPr>
+                <w:rFonts w:ascii="Calibri" w:cs="Calibri" w:eastAsia="Calibri" w:hAnsi="Calibri"/>
+                <w:b/>
+                <w:bCs/>
+                <w:color w:val="111111"/>
+                <w:sz w:val="16"/>
+                <w:szCs w:val="16"/>
+              </w:rPr>
+              <w:t xml:space="preserve">R1</w:t>
+            </w:r>
+          </w:p>
+        </w:tc>
+        <w:tc>
+          <w:tcPr>
+            <w:tcW w:type="dxa" w:w="2280"/>
+            <w:tcMar>
+              <w:top w:type="dxa" w:w="70"/>
+              <w:left w:type="dxa" w:w="110"/>
+              <w:bottom w:type="dxa" w:w="70"/>
+              <w:right w:type="dxa" w:w="110"/>
+            </w:tcMar>
+          </w:tcPr>
+          <w:p>
+            <w:pPr>
+              <w:spacing w:after="0" w:before="0" w:line="250"/>
+            </w:pPr>
+            <w:r>
+              <w:rPr>
+                <w:rFonts w:ascii="Calibri" w:cs="Calibri" w:eastAsia="Calibri" w:hAnsi="Calibri"/>
+                <w:color w:val="111111"/>
+                <w:sz w:val="16"/>
+                <w:szCs w:val="16"/>
+              </w:rPr>
+              <w:t xml:space="preserve">Open Clients and click someone tagged as a walk-in.</w:t>
+            </w:r>
+          </w:p>
+        </w:tc>
+        <w:tc>
+          <w:tcPr>
+            <w:tcW w:type="dxa" w:w="1960"/>
+            <w:tcMar>
+              <w:top w:type="dxa" w:w="70"/>
+              <w:left w:type="dxa" w:w="110"/>
+              <w:bottom w:type="dxa" w:w="70"/>
+              <w:right w:type="dxa" w:w="110"/>
+            </w:tcMar>
+          </w:tcPr>
+          <w:p>
+            <w:pPr>
+              <w:spacing w:after="0" w:before="0" w:line="250"/>
+            </w:pPr>
+            <w:r>
+              <w:rPr>
+                <w:rFonts w:ascii="Calibri" w:cs="Calibri" w:eastAsia="Calibri" w:hAnsi="Calibri"/>
+                <w:color w:val="111111"/>
+                <w:sz w:val="16"/>
+                <w:szCs w:val="16"/>
+              </w:rPr>
+              <w:t xml:space="preserve">Their panel opens with their visit history.</w:t>
+            </w:r>
+          </w:p>
+        </w:tc>
+        <w:tc>
+          <w:tcPr>
+            <w:tcW w:type="dxa" w:w="3116"/>
+            <w:tcMar>
+              <w:top w:type="dxa" w:w="70"/>
+              <w:left w:type="dxa" w:w="110"/>
+              <w:bottom w:type="dxa" w:w="70"/>
+              <w:right w:type="dxa" w:w="110"/>
+            </w:tcMar>
+          </w:tcPr>
+          <w:p>
+            <w:pPr>
+              <w:spacing w:after="0" w:before="0" w:line="250"/>
+            </w:pPr>
+            <w:r>
+              <w:rPr>
+                <w:rFonts w:ascii="Calibri" w:cs="Calibri" w:eastAsia="Calibri" w:hAnsi="Calibri"/>
+                <w:color w:val="111111"/>
+                <w:sz w:val="16"/>
+                <w:szCs w:val="16"/>
+              </w:rPr>
+              <w:t xml:space="preserve">Opens with phone number and every past visit. Previously these rows could not be clicked at all.</w:t>
+            </w:r>
+          </w:p>
+        </w:tc>
+        <w:tc>
+          <w:tcPr>
+            <w:tcW w:type="dxa" w:w="560"/>
+            <w:tcMar>
+              <w:top w:type="dxa" w:w="70"/>
+              <w:left w:type="dxa" w:w="110"/>
+              <w:bottom w:type="dxa" w:w="70"/>
+              <w:right w:type="dxa" w:w="110"/>
+            </w:tcMar>
+          </w:tcPr>
+          <w:p>
+            <w:pPr>
+              <w:spacing w:after="0" w:before="0" w:line="250"/>
+              <w:jc w:val="center"/>
+            </w:pPr>
+            <w:r>
+              <w:rPr>
+                <w:rFonts w:ascii="Calibri" w:cs="Calibri" w:eastAsia="Calibri" w:hAnsi="Calibri"/>
+                <w:b/>
+                <w:bCs/>
+                <w:color w:val="1E6B3A"/>
+                <w:sz w:val="15"/>
+                <w:szCs w:val="15"/>
+              </w:rPr>
+              <w:t xml:space="preserve">Pass</w:t>
+            </w:r>
+          </w:p>
+        </w:tc>
+        <w:tc>
+          <w:tcPr>
+            <w:tcW w:type="dxa" w:w="590"/>
+            <w:tcMar>
+              <w:top w:type="dxa" w:w="70"/>
+              <w:left w:type="dxa" w:w="110"/>
+              <w:bottom w:type="dxa" w:w="70"/>
+              <w:right w:type="dxa" w:w="110"/>
+            </w:tcMar>
+          </w:tcPr>
+          <w:p>
+            <w:pPr>
+              <w:spacing w:after="0" w:before="0" w:line="250"/>
+            </w:pPr>
+            <w:r>
+              <w:rPr>
+                <w:rFonts w:ascii="Calibri" w:cs="Calibri" w:eastAsia="Calibri" w:hAnsi="Calibri"/>
+                <w:color w:val="111111"/>
+                <w:sz w:val="17"/>
+                <w:szCs w:val="17"/>
+              </w:rPr>
+              <w:t xml:space="preserve"> </w:t>
+            </w:r>
+          </w:p>
+        </w:tc>
+      </w:tr>
+      <w:tr>
+        <w:tc>
+          <w:tcPr>
+            <w:tcW w:type="dxa" w:w="520"/>
+            <w:tcMar>
+              <w:top w:type="dxa" w:w="70"/>
+              <w:left w:type="dxa" w:w="110"/>
+              <w:bottom w:type="dxa" w:w="70"/>
+              <w:right w:type="dxa" w:w="110"/>
+            </w:tcMar>
+          </w:tcPr>
+          <w:p>
+            <w:pPr>
+              <w:spacing w:after="0" w:before="0" w:line="250"/>
+            </w:pPr>
+            <w:r>
+              <w:rPr>
+                <w:rFonts w:ascii="Calibri" w:cs="Calibri" w:eastAsia="Calibri" w:hAnsi="Calibri"/>
+                <w:b/>
+                <w:bCs/>
+                <w:color w:val="111111"/>
+                <w:sz w:val="16"/>
+                <w:szCs w:val="16"/>
+              </w:rPr>
+              <w:t xml:space="preserve">R2</w:t>
+            </w:r>
+          </w:p>
+        </w:tc>
+        <w:tc>
+          <w:tcPr>
+            <w:tcW w:type="dxa" w:w="2280"/>
+            <w:tcMar>
+              <w:top w:type="dxa" w:w="70"/>
+              <w:left w:type="dxa" w:w="110"/>
+              <w:bottom w:type="dxa" w:w="70"/>
+              <w:right w:type="dxa" w:w="110"/>
+            </w:tcMar>
+          </w:tcPr>
+          <w:p>
+            <w:pPr>
+              <w:spacing w:after="0" w:before="0" w:line="250"/>
+            </w:pPr>
+            <w:r>
+              <w:rPr>
+                <w:rFonts w:ascii="Calibri" w:cs="Calibri" w:eastAsia="Calibri" w:hAnsi="Calibri"/>
+                <w:color w:val="111111"/>
+                <w:sz w:val="16"/>
+                <w:szCs w:val="16"/>
+              </w:rPr>
+              <w:t xml:space="preserve">On a walk-in, press Create a client record.</w:t>
+            </w:r>
+          </w:p>
+        </w:tc>
+        <w:tc>
+          <w:tcPr>
+            <w:tcW w:type="dxa" w:w="1960"/>
+            <w:tcMar>
+              <w:top w:type="dxa" w:w="70"/>
+              <w:left w:type="dxa" w:w="110"/>
+              <w:bottom w:type="dxa" w:w="70"/>
+              <w:right w:type="dxa" w:w="110"/>
+            </w:tcMar>
+          </w:tcPr>
+          <w:p>
+            <w:pPr>
+              <w:spacing w:after="0" w:before="0" w:line="250"/>
+            </w:pPr>
+            <w:r>
+              <w:rPr>
+                <w:rFonts w:ascii="Calibri" w:cs="Calibri" w:eastAsia="Calibri" w:hAnsi="Calibri"/>
+                <w:color w:val="111111"/>
+                <w:sz w:val="16"/>
+                <w:szCs w:val="16"/>
+              </w:rPr>
+              <w:t xml:space="preserve">They become a proper client, keeping every past visit.</w:t>
+            </w:r>
+          </w:p>
+        </w:tc>
+        <w:tc>
+          <w:tcPr>
+            <w:tcW w:type="dxa" w:w="3116"/>
+            <w:tcMar>
+              <w:top w:type="dxa" w:w="70"/>
+              <w:left w:type="dxa" w:w="110"/>
+              <w:bottom w:type="dxa" w:w="70"/>
+              <w:right w:type="dxa" w:w="110"/>
+            </w:tcMar>
+          </w:tcPr>
+          <w:p>
+            <w:pPr>
+              <w:spacing w:after="0" w:before="0" w:line="250"/>
+            </w:pPr>
+            <w:r>
+              <w:rPr>
+                <w:rFonts w:ascii="Calibri" w:cs="Calibri" w:eastAsia="Calibri" w:hAnsi="Calibri"/>
+                <w:color w:val="111111"/>
+                <w:sz w:val="16"/>
+                <w:szCs w:val="16"/>
+              </w:rPr>
+              <w:t xml:space="preserve">Account created and six past visits attached to it.</w:t>
+            </w:r>
+          </w:p>
+        </w:tc>
+        <w:tc>
+          <w:tcPr>
+            <w:tcW w:type="dxa" w:w="560"/>
+            <w:tcMar>
+              <w:top w:type="dxa" w:w="70"/>
+              <w:left w:type="dxa" w:w="110"/>
+              <w:bottom w:type="dxa" w:w="70"/>
+              <w:right w:type="dxa" w:w="110"/>
+            </w:tcMar>
+          </w:tcPr>
+          <w:p>
+            <w:pPr>
+              <w:spacing w:after="0" w:before="0" w:line="250"/>
+              <w:jc w:val="center"/>
+            </w:pPr>
+            <w:r>
+              <w:rPr>
+                <w:rFonts w:ascii="Calibri" w:cs="Calibri" w:eastAsia="Calibri" w:hAnsi="Calibri"/>
+                <w:b/>
+                <w:bCs/>
+                <w:color w:val="1E6B3A"/>
+                <w:sz w:val="15"/>
+                <w:szCs w:val="15"/>
+              </w:rPr>
+              <w:t xml:space="preserve">Pass</w:t>
+            </w:r>
+          </w:p>
+        </w:tc>
+        <w:tc>
+          <w:tcPr>
+            <w:tcW w:type="dxa" w:w="590"/>
+            <w:tcMar>
+              <w:top w:type="dxa" w:w="70"/>
+              <w:left w:type="dxa" w:w="110"/>
+              <w:bottom w:type="dxa" w:w="70"/>
+              <w:right w:type="dxa" w:w="110"/>
+            </w:tcMar>
+          </w:tcPr>
+          <w:p>
+            <w:pPr>
+              <w:spacing w:after="0" w:before="0" w:line="250"/>
+            </w:pPr>
+            <w:r>
+              <w:rPr>
+                <w:rFonts w:ascii="Calibri" w:cs="Calibri" w:eastAsia="Calibri" w:hAnsi="Calibri"/>
+                <w:color w:val="111111"/>
+                <w:sz w:val="17"/>
+                <w:szCs w:val="17"/>
+              </w:rPr>
+              <w:t xml:space="preserve"> </w:t>
+            </w:r>
+          </w:p>
+        </w:tc>
+      </w:tr>
+      <w:tr>
+        <w:tc>
+          <w:tcPr>
+            <w:tcW w:type="dxa" w:w="520"/>
+            <w:tcMar>
+              <w:top w:type="dxa" w:w="70"/>
+              <w:left w:type="dxa" w:w="110"/>
+              <w:bottom w:type="dxa" w:w="70"/>
+              <w:right w:type="dxa" w:w="110"/>
+            </w:tcMar>
+          </w:tcPr>
+          <w:p>
+            <w:pPr>
+              <w:spacing w:after="0" w:before="0" w:line="250"/>
+            </w:pPr>
+            <w:r>
+              <w:rPr>
+                <w:rFonts w:ascii="Calibri" w:cs="Calibri" w:eastAsia="Calibri" w:hAnsi="Calibri"/>
+                <w:b/>
+                <w:bCs/>
+                <w:color w:val="111111"/>
+                <w:sz w:val="16"/>
+                <w:szCs w:val="16"/>
+              </w:rPr>
+              <w:t xml:space="preserve">R3</w:t>
+            </w:r>
+          </w:p>
+        </w:tc>
+        <w:tc>
+          <w:tcPr>
+            <w:tcW w:type="dxa" w:w="2280"/>
+            <w:tcMar>
+              <w:top w:type="dxa" w:w="70"/>
+              <w:left w:type="dxa" w:w="110"/>
+              <w:bottom w:type="dxa" w:w="70"/>
+              <w:right w:type="dxa" w:w="110"/>
+            </w:tcMar>
+          </w:tcPr>
+          <w:p>
+            <w:pPr>
+              <w:spacing w:after="0" w:before="0" w:line="250"/>
+            </w:pPr>
+            <w:r>
+              <w:rPr>
+                <w:rFonts w:ascii="Calibri" w:cs="Calibri" w:eastAsia="Calibri" w:hAnsi="Calibri"/>
+                <w:color w:val="111111"/>
+                <w:sz w:val="16"/>
+                <w:szCs w:val="16"/>
+              </w:rPr>
+              <w:t xml:space="preserve">Check the same person in the list afterwards.</w:t>
+            </w:r>
+          </w:p>
+        </w:tc>
+        <w:tc>
+          <w:tcPr>
+            <w:tcW w:type="dxa" w:w="1960"/>
+            <w:tcMar>
+              <w:top w:type="dxa" w:w="70"/>
+              <w:left w:type="dxa" w:w="110"/>
+              <w:bottom w:type="dxa" w:w="70"/>
+              <w:right w:type="dxa" w:w="110"/>
+            </w:tcMar>
+          </w:tcPr>
+          <w:p>
+            <w:pPr>
+              <w:spacing w:after="0" w:before="0" w:line="250"/>
+            </w:pPr>
+            <w:r>
+              <w:rPr>
+                <w:rFonts w:ascii="Calibri" w:cs="Calibri" w:eastAsia="Calibri" w:hAnsi="Calibri"/>
+                <w:color w:val="111111"/>
+                <w:sz w:val="16"/>
+                <w:szCs w:val="16"/>
+              </w:rPr>
+              <w:t xml:space="preserve">Now shows as registered with a loyalty balance.</w:t>
+            </w:r>
+          </w:p>
+        </w:tc>
+        <w:tc>
+          <w:tcPr>
+            <w:tcW w:type="dxa" w:w="3116"/>
+            <w:tcMar>
+              <w:top w:type="dxa" w:w="70"/>
+              <w:left w:type="dxa" w:w="110"/>
+              <w:bottom w:type="dxa" w:w="70"/>
+              <w:right w:type="dxa" w:w="110"/>
+            </w:tcMar>
+          </w:tcPr>
+          <w:p>
+            <w:pPr>
+              <w:spacing w:after="0" w:before="0" w:line="250"/>
+            </w:pPr>
+            <w:r>
+              <w:rPr>
+                <w:rFonts w:ascii="Calibri" w:cs="Calibri" w:eastAsia="Calibri" w:hAnsi="Calibri"/>
+                <w:color w:val="111111"/>
+                <w:sz w:val="16"/>
+                <w:szCs w:val="16"/>
+              </w:rPr>
+              <w:t xml:space="preserve">Confirmed.</w:t>
+            </w:r>
+          </w:p>
+        </w:tc>
+        <w:tc>
+          <w:tcPr>
+            <w:tcW w:type="dxa" w:w="560"/>
+            <w:tcMar>
+              <w:top w:type="dxa" w:w="70"/>
+              <w:left w:type="dxa" w:w="110"/>
+              <w:bottom w:type="dxa" w:w="70"/>
+              <w:right w:type="dxa" w:w="110"/>
+            </w:tcMar>
+          </w:tcPr>
+          <w:p>
+            <w:pPr>
+              <w:spacing w:after="0" w:before="0" w:line="250"/>
+              <w:jc w:val="center"/>
+            </w:pPr>
+            <w:r>
+              <w:rPr>
+                <w:rFonts w:ascii="Calibri" w:cs="Calibri" w:eastAsia="Calibri" w:hAnsi="Calibri"/>
+                <w:b/>
+                <w:bCs/>
+                <w:color w:val="1E6B3A"/>
+                <w:sz w:val="15"/>
+                <w:szCs w:val="15"/>
+              </w:rPr>
+              <w:t xml:space="preserve">Pass</w:t>
+            </w:r>
+          </w:p>
+        </w:tc>
+        <w:tc>
+          <w:tcPr>
+            <w:tcW w:type="dxa" w:w="590"/>
+            <w:tcMar>
+              <w:top w:type="dxa" w:w="70"/>
+              <w:left w:type="dxa" w:w="110"/>
+              <w:bottom w:type="dxa" w:w="70"/>
+              <w:right w:type="dxa" w:w="110"/>
+            </w:tcMar>
+          </w:tcPr>
+          <w:p>
+            <w:pPr>
+              <w:spacing w:after="0" w:before="0" w:line="250"/>
+            </w:pPr>
+            <w:r>
+              <w:rPr>
+                <w:rFonts w:ascii="Calibri" w:cs="Calibri" w:eastAsia="Calibri" w:hAnsi="Calibri"/>
+                <w:color w:val="111111"/>
+                <w:sz w:val="17"/>
+                <w:szCs w:val="17"/>
+              </w:rPr>
+              <w:t xml:space="preserve"> </w:t>
+            </w:r>
+          </w:p>
+        </w:tc>
+      </w:tr>
+    </w:tbl>
+    <w:p>
+      <w:pPr>
+        <w:spacing w:after="160"/>
+      </w:pPr>
+    </w:p>
+    <w:p>
+      <w:pPr>
+        <w:pStyle w:val="Heading2"/>
+        <w:spacing w:after="120" w:before="280"/>
+      </w:pPr>
+      <w:r>
+        <w:rPr>
+          <w:rFonts w:ascii="Calibri" w:cs="Calibri" w:eastAsia="Calibri" w:hAnsi="Calibri"/>
+          <w:b/>
+          <w:bCs/>
+          <w:color w:val="8A6D1F"/>
+          <w:sz w:val="24"/>
+          <w:szCs w:val="24"/>
+        </w:rPr>
         <w:t xml:space="preserve">O · Look and feel</w:t>
       </w:r>
     </w:p>
@@ -23549,7 +28159,7 @@
                 <w:sz w:val="16"/>
                 <w:szCs w:val="16"/>
               </w:rPr>
-              <w:t xml:space="preserve">Gents salon language — barbers, not stylists. No ladies’ services.</w:t>
+              <w:t xml:space="preserve">Gents salon language — barbers, not stylists, and no ranks. No ladies’ services.</w:t>
             </w:r>
           </w:p>
         </w:tc>
@@ -23574,7 +28184,7 @@
                 <w:sz w:val="16"/>
                 <w:szCs w:val="16"/>
               </w:rPr>
-              <w:t xml:space="preserve">“Master barbers” throughout; the 12 services are cuts, beards, shaves and grooming only.</w:t>
+              <w:t xml:space="preserve">Every barber is simply “Barber”; the 12 services are cuts, beards, shaves and grooming only.</w:t>
             </w:r>
           </w:p>
         </w:tc>

</xml_diff>